<commit_message>
fix: uji coba hanya mengevaluasi SiapKerja, tanpa banding merek
Pedoman v1.2 dan tiga kuesioner (pra, pasca, pengamat) tidak lagi
membandingkan dengan K2R, LEGO, juara, atau metode latihan lain.
Word siap Quick Import ke Microsoft Forms.
</commit_message>
<xml_diff>
--- a/SiapKerja_Pedoman_UjiCoba.docx
+++ b/SiapKerja_Pedoman_UjiCoba.docx
@@ -49,7 +49,9 @@
         </w:rPr>
         <w:t>Untuk fasilitator sesi undangan (kampus, perusahaan, atau individu).</w:t>
         <w:br/>
-        <w:t>Bukan prosedur proyek. Bukan kompetisi. Jangan menulis nama orang atau nama instansi di isian.</w:t>
+        <w:t>Fokus: mengevaluasi SiapKerja sebagai alat ajar LPS pada rumah Type-36.</w:t>
+        <w:br/>
+        <w:t>Jangan menulis nama orang atau nama instansi di isian.</w:t>
       </w:r>
     </w:p>
     <w:p>
@@ -80,7 +82,7 @@
           <w:color w:val="1C1917"/>
           <w:sz w:val="22"/>
         </w:rPr>
-        <w:t>Uji coba ini mengukur apakah peserta menjalankan LPS (pull, make-ready, janji, huddle, PPC) pada pekerjaan lapangan rumah Type-36, bukan merakit LEGO dan bukan memperebutkan juara. Hasilnya untuk paper pembelajaran, bersifat eksploratori — bukan uji acak, bukan penilaian kinerja organisasi.</w:t>
+        <w:t>Uji coba ini mengukur dua hal pada SiapKerja!, dan hanya itu: (1) apakah peserta dapat menjalankan alur LPS di aplikasi (value pemilik, desain, pull, make-ready, janji mingguan, huddle, PPC) pada pekerjaan rumah Type-36; (2) bagaimana mereka menilai kejelasan, keaslian pekerjaan, dan kegunaan SiapKerja sebagai alat latihan.</w:t>
       </w:r>
     </w:p>
     <w:p>
@@ -95,7 +97,7 @@
           <w:color w:val="1C1917"/>
           <w:sz w:val="22"/>
         </w:rPr>
-        <w:t>Yang dicari: perubahan cara pandang push → pull, keandalan janji, dan apakah alat bisa dipakai setelah satu kali daring di tempat sinyal lemah.</w:t>
+        <w:t>Hasil untuk paper pembelajaran, bersifat eksploratori — bukan uji acak, bukan penilaian kinerja organisasi, bukan perbandingan dengan alat atau metode latihan lain. Jangan menempatkan SiapKerja berhadapan dengan permainan, kontes, atau merek latihan lain di undangan, brief, maupun kuesioner.</w:t>
       </w:r>
     </w:p>
     <w:p>
@@ -111,7 +113,7 @@
           <w:color w:val="9A4519"/>
           <w:sz w:val="28"/>
         </w:rPr>
-        <w:t>2. Tiga Microsoft Form — jangan digabung</w:t>
+        <w:t>2. Tiga formulir — jangan digabung</w:t>
       </w:r>
     </w:p>
     <w:p>
@@ -126,7 +128,7 @@
           <w:color w:val="1C1917"/>
           <w:sz w:val="22"/>
         </w:rPr>
-        <w:t>Microsoft Forms tidak cocok untuk pra dan pasca dalam satu tautan (peserta akan mengisi “sebelum” setelah tahu jawabannya). Buat tiga Form terpisah dari tiga berkas Word, lalu tempel tautannya di tabel ini sebelum sesi.</w:t>
+        <w:t>Pra dan pasca harus tautan terpisah agar “sebelum main” tidak diisi setelah tahu jawabannya. Buat tiga Form Microsoft dari tiga berkas Word di bawah, lalu tempel tautannya sebelum sesi.</w:t>
       </w:r>
     </w:p>
     <w:tbl>
@@ -719,7 +721,7 @@
           <w:color w:val="57534E"/>
           <w:sz w:val="20"/>
         </w:rPr>
-        <w:t>Cara import: forms.office.com → New Form (bukan Quiz) → Quick import / From Word → pilih berkas. Set Required pada kode R dan kode G. Matikan penskoran.</w:t>
+        <w:t>Cara import: forms.office.com → New Form (bukan Quiz) → Quick import / From Word → pilih berkas. Set Required pada kode R dan kode G. Matikan penskoran. Draf butir ada di SiapKerja_Draft_Kuesioner.md.</w:t>
       </w:r>
     </w:p>
     <w:p>
@@ -766,7 +768,7 @@
           <w:color w:val="1C1917"/>
           <w:sz w:val="22"/>
         </w:rPr>
-        <w:t>Siapkan 1 laptop per kelompok (bukan 1 orang 1 laptop). Chrome atau Edge. Buka SiapKerja! sekali saat masih ada sinyal agar tersimpan di browser.</w:t>
+        <w:t>Siapkan 1 laptop per kelompok. Chrome atau Edge. Buka SiapKerja! sekali saat masih ada sinyal agar tersimpan di browser.</w:t>
       </w:r>
     </w:p>
     <w:p>
@@ -1173,7 +1175,7 @@
           <w:color w:val="1C1917"/>
           <w:sz w:val="22"/>
         </w:rPr>
-        <w:t>Uji tautan ketiga Form (buka di HP). Form = survei, bukan kuis berpoin.</w:t>
+        <w:t>Uji tautan ketiga Form. Form = survei, bukan kuis berpoin.</w:t>
       </w:r>
     </w:p>
     <w:p>
@@ -1189,7 +1191,7 @@
           <w:color w:val="1C1917"/>
           <w:sz w:val="22"/>
         </w:rPr>
-        <w:t>Undangan: 6–12 orang per sesi, 2–4 kelompok. Campuran “pernah K2R / belum” berguna. Beberapa sesi boleh dijumlahkan di paper (kategori organisasi, tanpa nama).</w:t>
+        <w:t>Undangan: 6–12 orang per sesi, 2–4 kelompok. Siapa pun yang perlu berlatih LPS. Beberapa sesi boleh dijumlahkan di paper (kategori organisasi, tanpa nama).</w:t>
       </w:r>
     </w:p>
     <w:p>
@@ -1206,6 +1208,22 @@
           <w:sz w:val="22"/>
         </w:rPr>
         <w:t>Satu pengamat (Anda atau asisten) mengisi Form 3, bukan peserta.</w:t>
+      </w:r>
+    </w:p>
+    <w:p>
+      <w:pPr>
+        <w:pStyle w:val="ListNumber"/>
+        <w:spacing w:after="60"/>
+      </w:pPr>
+      <w:r>
+        <w:rPr>
+          <w:rFonts w:ascii="Calibri" w:hAnsi="Calibri" w:eastAsia="Calibri"/>
+          <w:b w:val="0"/>
+          <w:i w:val="0"/>
+          <w:color w:val="1C1917"/>
+          <w:sz w:val="22"/>
+        </w:rPr>
+        <w:t>Undangan dan slide hanya menyebut SiapKerja dan LPS. Jangan menyebut merek atau format latihan lain.</w:t>
       </w:r>
     </w:p>
     <w:p>
@@ -1373,7 +1391,7 @@
                 <w:color w:val="1C1917"/>
                 <w:sz w:val="20"/>
               </w:rPr>
-              <w:t>Consent (bacakan butir 7) + peserta mengisi Form 1 di HP/laptop cadangan. Laptop simulasi belum disentuh.</w:t>
+              <w:t>Consent (bacakan butir 7) + peserta mengisi Form 1. Laptop simulasi belum disentuh.</w:t>
             </w:r>
           </w:p>
         </w:tc>
@@ -1458,7 +1476,7 @@
                 <w:color w:val="1C1917"/>
                 <w:sz w:val="20"/>
               </w:rPr>
-              <w:t>Brief 7 menit. LPS = janji andal, bukan siapa selesai dulu. SiapKerja! = latihan metode, bukan kompetisi. Tunjukkan alur tab sekali, tanpa spoiler make-ready.</w:t>
+              <w:t>Brief 7 menit: LPS di SiapKerja (alur tab, last planner, PPC = keandalan janji). Tanpa spoiler make-ready.</w:t>
             </w:r>
           </w:p>
         </w:tc>
@@ -1569,7 +1587,7 @@
                 <w:color w:val="1C1917"/>
                 <w:sz w:val="20"/>
               </w:rPr>
-              <w:t>Form 3 Pengamat (selama ini)</w:t>
+              <w:t>Form 3 Pengamat</w:t>
             </w:r>
           </w:p>
         </w:tc>
@@ -1627,7 +1645,7 @@
                 <w:color w:val="1C1917"/>
                 <w:sz w:val="20"/>
               </w:rPr>
-              <w:t>Unduh JSON sesi (tombol Unduh sesi). Nama file: {kode-sesi}-G{n}.json  contoh S260825-A-G2.json</w:t>
+              <w:t>Unduh JSON sesi (tombol Unduh sesi). Nama file: {kode-sesi}-G{n}.json</w:t>
             </w:r>
           </w:p>
         </w:tc>
@@ -1761,7 +1779,7 @@
           <w:color w:val="1C1917"/>
           <w:sz w:val="22"/>
         </w:rPr>
-        <w:t>Jika waktu habis sebelum huddle: jangan memaksa rumah 100%. Catat tab terakhir di Form 3. Itu temuan, bukan kegagalan sesi.</w:t>
+        <w:t>Jika waktu habis sebelum huddle: jangan memaksa rumah 100%. Catat tab terakhir di Form 3. Itu temuan tentang SiapKerja di sesi 90 menit, bukan kegagalan peserta.</w:t>
       </w:r>
     </w:p>
     <w:p>
@@ -2183,7 +2201,7 @@
           <w:color w:val="1C1917"/>
           <w:sz w:val="22"/>
         </w:rPr>
-        <w:t>Tidak ada juara, hadiah, papan skor, atau “kelompok mana Kurva S-nya paling tinggi”.</w:t>
+        <w:t>Jangan meranking kelompok atau membandingkan progres antar laptop.</w:t>
       </w:r>
     </w:p>
     <w:p>
@@ -2199,7 +2217,7 @@
           <w:color w:val="1C1917"/>
           <w:sz w:val="22"/>
         </w:rPr>
-        <w:t>Tidak menawar mutu.</w:t>
+        <w:t>Jangan menawar mutu di simulasi.</w:t>
       </w:r>
     </w:p>
     <w:p>
@@ -2215,7 +2233,7 @@
           <w:color w:val="1C1917"/>
           <w:sz w:val="22"/>
         </w:rPr>
-        <w:t>Tidak mengisi formulir untuk orang lain.</w:t>
+        <w:t>Jangan mengisi formulir untuk orang lain.</w:t>
       </w:r>
     </w:p>
     <w:p>
@@ -2231,7 +2249,7 @@
           <w:color w:val="1C1917"/>
           <w:sz w:val="22"/>
         </w:rPr>
-        <w:t>Tidak menulis nama orang atau nama instansi di isian (hanya kategori: kontraktor / kampus / …).</w:t>
+        <w:t>Jangan menulis nama orang atau nama instansi (hanya kategori: kontraktor / kampus / …).</w:t>
       </w:r>
     </w:p>
     <w:p>
@@ -2247,7 +2265,23 @@
           <w:color w:val="1C1917"/>
           <w:sz w:val="22"/>
         </w:rPr>
-        <w:t>Tidak mengklaim bahwa uji coba ini menaikkan PPC proyek nyata.</w:t>
+        <w:t>Jangan mengklaim bahwa uji coba ini menaikkan PPC proyek nyata.</w:t>
+      </w:r>
+    </w:p>
+    <w:p>
+      <w:pPr>
+        <w:pStyle w:val="ListBullet"/>
+        <w:spacing w:after="60" w:line="276" w:lineRule="auto"/>
+      </w:pPr>
+      <w:r>
+        <w:rPr>
+          <w:rFonts w:ascii="Calibri" w:hAnsi="Calibri" w:eastAsia="Calibri"/>
+          <w:b w:val="0"/>
+          <w:i w:val="0"/>
+          <w:color w:val="1C1917"/>
+          <w:sz w:val="22"/>
+        </w:rPr>
+        <w:t>Jangan membandingkan SiapKerja dengan alat, permainan, atau merek latihan lain — di undangan, brief, maupun isian.</w:t>
       </w:r>
     </w:p>
     <w:p>
@@ -2278,7 +2312,7 @@
           <w:color w:val="1C1917"/>
           <w:sz w:val="22"/>
         </w:rPr>
-        <w:t>“Ini uji coba alat ajar Last Planner System untuk paper akademik. Isian tanpa nama orang dan tanpa nama instansi. Partisipasi sukarela, boleh berhenti kapan saja. File sesi simulator tidak berisi identitas. Data dipakai untuk menyempurnakan pembelajaran LPS, bukan untuk menilai kinerja proyek atau kampus Anda.”</w:t>
+        <w:t>“Ini uji coba SiapKerja, alat ajar Last Planner System, untuk paper akademik. Kami mengevaluasi aplikasi ini, bukan menilai Anda atau organisasi Anda. Isian tanpa nama orang dan tanpa nama instansi. Partisipasi sukarela, boleh berhenti kapan saja. File sesi simulator tidak berisi identitas. Data dipakai untuk menyempurnakan SiapKerja sebagai pembelajaran LPS.”</w:t>
       </w:r>
     </w:p>
     <w:p>
@@ -2341,7 +2375,7 @@
           <w:color w:val="1C1917"/>
           <w:sz w:val="22"/>
         </w:rPr>
-        <w:t>Geser yang harus dirasakan: push (Gantt) menjadi pull (pekerjaan jalan karena siap).</w:t>
+        <w:t>Di SiapKerja, objeknya pekerjaan rumah Type-36: site, galian, kolom, dinding, atap, MEP, finishing.</w:t>
       </w:r>
     </w:p>
     <w:p>
@@ -2357,7 +2391,23 @@
           <w:color w:val="1C1917"/>
           <w:sz w:val="22"/>
         </w:rPr>
-        <w:t>Skor di sini adalah keandalan janji (PPC), bukan kecepatan selesai.</w:t>
+        <w:t>Geser yang harus dirasakan: merencana dari Gantt menjadi merencana dari pekerjaan yang sudah siap (pull).</w:t>
+      </w:r>
+    </w:p>
+    <w:p>
+      <w:pPr>
+        <w:pStyle w:val="ListBullet"/>
+        <w:spacing w:after="60" w:line="276" w:lineRule="auto"/>
+      </w:pPr>
+      <w:r>
+        <w:rPr>
+          <w:rFonts w:ascii="Calibri" w:hAnsi="Calibri" w:eastAsia="Calibri"/>
+          <w:b w:val="0"/>
+          <w:i w:val="0"/>
+          <w:color w:val="1C1917"/>
+          <w:sz w:val="22"/>
+        </w:rPr>
+        <w:t>Angka yang dilihat di akhir adalah PPC: keandalan janji minggu itu.</w:t>
       </w:r>
     </w:p>
     <w:p>
@@ -2404,7 +2454,7 @@
           <w:color w:val="1C1917"/>
           <w:sz w:val="22"/>
         </w:rPr>
-        <w:t>Jangan menjawab “L1 harus bersih dulu” sebagai kunci ujian — biarkan mereka menabrak gerbang di aplikasi.</w:t>
+        <w:t>Jangan menjawab “L1 harus bersih dulu” sebagai kunci — biarkan mereka menabrak gerbang di aplikasi.</w:t>
       </w:r>
     </w:p>
     <w:p>
@@ -2420,7 +2470,7 @@
           <w:color w:val="1C1917"/>
           <w:sz w:val="22"/>
         </w:rPr>
-        <w:t>Jangan memuji kelompok yang lebih cepat mencapai 100%.</w:t>
+        <w:t>Jangan memuji kelompok yang lebih cepat mencapai 100% rumah.</w:t>
       </w:r>
     </w:p>
     <w:p>
@@ -2436,7 +2486,7 @@
           <w:color w:val="1C1917"/>
           <w:sz w:val="22"/>
         </w:rPr>
-        <w:t>Jangan membandingkan dengan juara K2R.</w:t>
+        <w:t>Jangan menyebut, memuji, atau menempatkan SiapKerja berhadapan dengan alat atau merek latihan lain.</w:t>
       </w:r>
     </w:p>
     <w:p>
@@ -2909,7 +2959,7 @@
           <w:color w:val="1C1917"/>
           <w:sz w:val="22"/>
         </w:rPr>
-        <w:t>Kirim ke peneliti: tiga Excel + file JSON. Jangan kirim daftar hadir bernama. Olah sesuai instrumen v1.1 (indeks cara pandang LPS, perilaku metode, persepsi). Paper hanya menulis kategori organisasi dan n, bukan merek tuan rumah.</w:t>
+        <w:t>Kirim ke peneliti: tiga Excel + file JSON. Jangan kirim daftar hadir bernama. Olah sesuai instrumen v1.2 (cara pandang LPS pra–pasca, perilaku di SiapKerja, persepsi alat). Paper hanya menulis kategori organisasi dan n, bukan merek tuan rumah.</w:t>
       </w:r>
     </w:p>
     <w:p>
@@ -3077,7 +3127,7 @@
                 <w:color w:val="1C1917"/>
                 <w:sz w:val="20"/>
               </w:rPr>
-              <w:t>Beban waktu (R8), bukan alat rusak</w:t>
+              <w:t>Beban waktu sesi 90 menit pada SiapKerja</w:t>
             </w:r>
           </w:p>
         </w:tc>
@@ -3162,7 +3212,7 @@
                 <w:color w:val="1C1917"/>
                 <w:sz w:val="20"/>
               </w:rPr>
-              <w:t>Gating / brief (R4)</w:t>
+              <w:t>Gating / brief</w:t>
             </w:r>
           </w:p>
         </w:tc>
@@ -3246,7 +3296,7 @@
                 <w:color w:val="1C1917"/>
                 <w:sz w:val="20"/>
               </w:rPr>
-              <w:t>Itu skenario R7</w:t>
+              <w:t>Uji kegunaan daring-sekali</w:t>
             </w:r>
           </w:p>
         </w:tc>
@@ -3458,6 +3508,21 @@
           <w:color w:val="1C1917"/>
           <w:sz w:val="22"/>
         </w:rPr>
+        <w:t>☐  Undangan dan brief hanya menyebut SiapKerja dan LPS</w:t>
+      </w:r>
+    </w:p>
+    <w:p>
+      <w:pPr>
+        <w:spacing w:after="80"/>
+      </w:pPr>
+      <w:r>
+        <w:rPr>
+          <w:rFonts w:ascii="Calibri" w:hAnsi="Calibri" w:eastAsia="Calibri"/>
+          <w:b w:val="0"/>
+          <w:i w:val="0"/>
+          <w:color w:val="1C1917"/>
+          <w:sz w:val="22"/>
+        </w:rPr>
         <w:t>☐  Consent dibacakan</w:t>
       </w:r>
     </w:p>
@@ -3488,7 +3553,7 @@
           <w:color w:val="1C1917"/>
           <w:sz w:val="22"/>
         </w:rPr>
-        <w:t>☐  Tidak ada ranking</w:t>
+        <w:t>☐  Tidak meranking kelompok</w:t>
       </w:r>
     </w:p>
     <w:p>
@@ -3578,9 +3643,9 @@
           <w:color w:val="57534E"/>
           <w:sz w:val="18"/>
         </w:rPr>
-        <w:t>SiapKerja! 1.19.1  ·  Pedoman uji coba v1.1  ·  25 Agustus 2026</w:t>
+        <w:t>SiapKerja! 1.19.1  ·  Pedoman uji coba v1.2  ·  25 Agustus 2026</w:t>
         <w:br/>
-        <w:t>Berkas terkait: SiapKerja_MSForms_01_Pra.docx  ·  02_Pasca.docx  ·  03_Pengamat.docx  ·  SiapKerja_Instrumen_UjiCoba.md</w:t>
+        <w:t>Berkas terkait: SiapKerja_MSForms_01_Pra.docx  ·  02_Pasca.docx  ·  03_Pengamat.docx  ·  SiapKerja_Draft_Kuesioner.md</w:t>
       </w:r>
     </w:p>
     <w:sectPr>
@@ -3609,7 +3674,7 @@
         <w:color w:val="57534E"/>
         <w:sz w:val="16"/>
       </w:rPr>
-      <w:t>SiapKerja! 1.19.1  ·  Pedoman uji coba v1.1  ·  tanpa nama instansi</w:t>
+      <w:t>SiapKerja! 1.19.1  ·  Pedoman uji coba v1.2  ·  evaluasi SiapKerja saja</w:t>
     </w:r>
   </w:p>
 </w:ftr>

</xml_diff>

<commit_message>
fix: uji coba hanya evaluasi SiapKerja (v1.3)
Hapus bingkai perbandingan di pedoman, draf kuesioner, dan halaman uji coba.
Tambah Draft_Kuesioner.docx untuk tiga Form Microsoft.
</commit_message>
<xml_diff>
--- a/SiapKerja_Pedoman_UjiCoba.docx
+++ b/SiapKerja_Pedoman_UjiCoba.docx
@@ -82,7 +82,7 @@
           <w:color w:val="1C1917"/>
           <w:sz w:val="22"/>
         </w:rPr>
-        <w:t>Uji coba ini mengukur dua hal pada SiapKerja!, dan hanya itu: (1) apakah peserta dapat menjalankan alur LPS di aplikasi (value pemilik, desain, pull, make-ready, janji mingguan, huddle, PPC) pada pekerjaan rumah Type-36; (2) bagaimana mereka menilai kejelasan, keaslian pekerjaan, dan kegunaan SiapKerja sebagai alat latihan.</w:t>
+        <w:t>Uji coba ini mengukur dua hal pada SiapKerja!: (1) apakah peserta dapat menjalankan alur LPS di aplikasi (value pemilik, desain, pull, make-ready, janji mingguan, huddle, PPC) pada pekerjaan rumah Type-36; (2) bagaimana mereka menilai kejelasan pekerjaan, kejelasan metode LPS, dan kegunaan SiapKerja sebagai alat latihan.</w:t>
       </w:r>
     </w:p>
     <w:p>
@@ -97,7 +97,7 @@
           <w:color w:val="1C1917"/>
           <w:sz w:val="22"/>
         </w:rPr>
-        <w:t>Hasil untuk paper pembelajaran, bersifat eksploratori — bukan uji acak, bukan penilaian kinerja organisasi, bukan perbandingan dengan alat atau metode latihan lain. Jangan menempatkan SiapKerja berhadapan dengan permainan, kontes, atau merek latihan lain di undangan, brief, maupun kuesioner.</w:t>
+        <w:t>Hasil untuk paper pembelajaran, bersifat eksploratori. Bukan uji acak. Bukan penilaian kinerja orang atau organisasi. Objeknya hanya aplikasi SiapKerja.</w:t>
       </w:r>
     </w:p>
     <w:p>
@@ -128,7 +128,7 @@
           <w:color w:val="1C1917"/>
           <w:sz w:val="22"/>
         </w:rPr>
-        <w:t>Pra dan pasca harus tautan terpisah agar “sebelum main” tidak diisi setelah tahu jawabannya. Buat tiga Form Microsoft dari tiga berkas Word di bawah, lalu tempel tautannya sebelum sesi.</w:t>
+        <w:t>Pra dan pasca harus tautan terpisah agar “sebelum main” tidak diisi setelah tahu jawabannya. Buat tiga Form Microsoft dari tiga berkas Word di bawah, lalu tempel tautannya sebelum sesi. Draf butir lengkap: SiapKerja_Draft_Kuesioner.docx.</w:t>
       </w:r>
     </w:p>
     <w:tbl>
@@ -721,7 +721,7 @@
           <w:color w:val="57534E"/>
           <w:sz w:val="20"/>
         </w:rPr>
-        <w:t>Cara import: forms.office.com → New Form (bukan Quiz) → Quick import / From Word → pilih berkas. Set Required pada kode R dan kode G. Matikan penskoran. Draf butir ada di SiapKerja_Draft_Kuesioner.md.</w:t>
+        <w:t>Cara import: forms.office.com → New Form (bukan Quiz) → Quick import / From Word → pilih berkas. Set Required pada kode R dan kode G. Matikan penskoran. Lihat SiapKerja_MSForms_CaraUnggah.md.</w:t>
       </w:r>
     </w:p>
     <w:p>
@@ -1223,7 +1223,7 @@
           <w:color w:val="1C1917"/>
           <w:sz w:val="22"/>
         </w:rPr>
-        <w:t>Undangan dan slide hanya menyebut SiapKerja dan LPS. Jangan menyebut merek atau format latihan lain.</w:t>
+        <w:t>Undangan dan slide hanya menjelaskan SiapKerja dan LPS yang akan dijalankan.</w:t>
       </w:r>
     </w:p>
     <w:p>
@@ -2201,7 +2201,7 @@
           <w:color w:val="1C1917"/>
           <w:sz w:val="22"/>
         </w:rPr>
-        <w:t>Jangan meranking kelompok atau membandingkan progres antar laptop.</w:t>
+        <w:t>Jangan meranking kelompok.</w:t>
       </w:r>
     </w:p>
     <w:p>
@@ -2270,22 +2270,6 @@
     </w:p>
     <w:p>
       <w:pPr>
-        <w:pStyle w:val="ListBullet"/>
-        <w:spacing w:after="60" w:line="276" w:lineRule="auto"/>
-      </w:pPr>
-      <w:r>
-        <w:rPr>
-          <w:rFonts w:ascii="Calibri" w:hAnsi="Calibri" w:eastAsia="Calibri"/>
-          <w:b w:val="0"/>
-          <w:i w:val="0"/>
-          <w:color w:val="1C1917"/>
-          <w:sz w:val="22"/>
-        </w:rPr>
-        <w:t>Jangan membandingkan SiapKerja dengan alat, permainan, atau merek latihan lain — di undangan, brief, maupun isian.</w:t>
-      </w:r>
-    </w:p>
-    <w:p>
-      <w:pPr>
         <w:pStyle w:val="Heading1"/>
         <w:spacing w:before="280" w:after="120"/>
       </w:pPr>
@@ -2328,7 +2312,7 @@
           <w:color w:val="9A4519"/>
           <w:sz w:val="28"/>
         </w:rPr>
-        <w:t>8. Brief 7 menit — yang boleh dan tidak boleh dikatakan</w:t>
+        <w:t>8. Brief 7 menit — yang dikatakan</w:t>
       </w:r>
     </w:p>
     <w:p>
@@ -2343,7 +2327,7 @@
           <w:color w:val="1C1917"/>
           <w:sz w:val="22"/>
         </w:rPr>
-        <w:t>Boleh:</w:t>
+        <w:t>Katakan:</w:t>
       </w:r>
     </w:p>
     <w:p>
@@ -2391,7 +2375,7 @@
           <w:color w:val="1C1917"/>
           <w:sz w:val="22"/>
         </w:rPr>
-        <w:t>Geser yang harus dirasakan: merencana dari Gantt menjadi merencana dari pekerjaan yang sudah siap (pull).</w:t>
+        <w:t>Yang dirasakan: merencana dari Gantt menjadi merencana dari pekerjaan yang sudah siap (pull).</w:t>
       </w:r>
     </w:p>
     <w:p>
@@ -2438,7 +2422,7 @@
           <w:color w:val="1C1917"/>
           <w:sz w:val="22"/>
         </w:rPr>
-        <w:t>Jangan:</w:t>
+        <w:t>Tahan:</w:t>
       </w:r>
     </w:p>
     <w:p>
@@ -2470,23 +2454,7 @@
           <w:color w:val="1C1917"/>
           <w:sz w:val="22"/>
         </w:rPr>
-        <w:t>Jangan memuji kelompok yang lebih cepat mencapai 100% rumah.</w:t>
-      </w:r>
-    </w:p>
-    <w:p>
-      <w:pPr>
-        <w:pStyle w:val="ListBullet"/>
-        <w:spacing w:after="60" w:line="276" w:lineRule="auto"/>
-      </w:pPr>
-      <w:r>
-        <w:rPr>
-          <w:rFonts w:ascii="Calibri" w:hAnsi="Calibri" w:eastAsia="Calibri"/>
-          <w:b w:val="0"/>
-          <w:i w:val="0"/>
-          <w:color w:val="1C1917"/>
-          <w:sz w:val="22"/>
-        </w:rPr>
-        <w:t>Jangan menyebut, memuji, atau menempatkan SiapKerja berhadapan dengan alat atau merek latihan lain.</w:t>
+        <w:t>Jangan memuji kelompok yang lebih cepat mencapai 100% rumah. PPC dan alasan variansi yang dibahas, bukan siapa selesai dulu.</w:t>
       </w:r>
     </w:p>
     <w:p>
@@ -2959,7 +2927,7 @@
           <w:color w:val="1C1917"/>
           <w:sz w:val="22"/>
         </w:rPr>
-        <w:t>Kirim ke peneliti: tiga Excel + file JSON. Jangan kirim daftar hadir bernama. Olah sesuai instrumen v1.2 (cara pandang LPS pra–pasca, perilaku di SiapKerja, persepsi alat). Paper hanya menulis kategori organisasi dan n, bukan merek tuan rumah.</w:t>
+        <w:t>Kirim ke peneliti: tiga Excel + file JSON. Jangan kirim daftar hadir bernama. Olah sesuai instrumen v1.3 (cara pandang LPS pra–pasca, perilaku di SiapKerja, persepsi alat). Paper hanya menulis kategori organisasi dan n, bukan nama tuan rumah.</w:t>
       </w:r>
     </w:p>
     <w:p>
@@ -3508,21 +3476,6 @@
           <w:color w:val="1C1917"/>
           <w:sz w:val="22"/>
         </w:rPr>
-        <w:t>☐  Undangan dan brief hanya menyebut SiapKerja dan LPS</w:t>
-      </w:r>
-    </w:p>
-    <w:p>
-      <w:pPr>
-        <w:spacing w:after="80"/>
-      </w:pPr>
-      <w:r>
-        <w:rPr>
-          <w:rFonts w:ascii="Calibri" w:hAnsi="Calibri" w:eastAsia="Calibri"/>
-          <w:b w:val="0"/>
-          <w:i w:val="0"/>
-          <w:color w:val="1C1917"/>
-          <w:sz w:val="22"/>
-        </w:rPr>
         <w:t>☐  Consent dibacakan</w:t>
       </w:r>
     </w:p>
@@ -3643,9 +3596,9 @@
           <w:color w:val="57534E"/>
           <w:sz w:val="18"/>
         </w:rPr>
-        <w:t>SiapKerja! 1.19.1  ·  Pedoman uji coba v1.2  ·  25 Agustus 2026</w:t>
+        <w:t>SiapKerja! 1.19.1  ·  Pedoman uji coba v1.3  ·  25 Agustus 2026</w:t>
         <w:br/>
-        <w:t>Berkas terkait: SiapKerja_MSForms_01_Pra.docx  ·  02_Pasca.docx  ·  03_Pengamat.docx  ·  SiapKerja_Draft_Kuesioner.md</w:t>
+        <w:t>Berkas terkait: SiapKerja_Draft_Kuesioner.docx  ·  MSForms_01_Pra  ·  02_Pasca  ·  03_Pengamat</w:t>
       </w:r>
     </w:p>
     <w:sectPr>
@@ -3674,7 +3627,7 @@
         <w:color w:val="57534E"/>
         <w:sz w:val="16"/>
       </w:rPr>
-      <w:t>SiapKerja! 1.19.1  ·  Pedoman uji coba v1.2  ·  evaluasi SiapKerja saja</w:t>
+      <w:t>SiapKerja! 1.19.1  ·  Pedoman uji coba v1.3  ·  evaluasi SiapKerja</w:t>
     </w:r>
   </w:p>
 </w:ftr>

</xml_diff>

<commit_message>
docs: pedoman v1.5 — ketua peneliti pemilik Form, fasilitator menjalankan sesi
Satu set Microsoft Form untuk semua perusahaan. Fasilitator (co-author)
hanya membagikan tautan, mengisi Form 3, dan mengirim JSON.
Draf kuesioner dan Word import tidak lagi di halaman Uji coba.
</commit_message>
<xml_diff>
--- a/SiapKerja_Pedoman_UjiCoba.docx
+++ b/SiapKerja_Pedoman_UjiCoba.docx
@@ -47,11 +47,11 @@
           <w:color w:val="57534E"/>
           <w:sz w:val="22"/>
         </w:rPr>
-        <w:t>Untuk fasilitator sesi undangan (kampus, perusahaan, atau individu).</w:t>
+        <w:t>Untuk fasilitator di perusahaan (rekan penulis paper).</w:t>
         <w:br/>
-        <w:t>Fokus: mengevaluasi SiapKerja sebagai alat ajar LPS pada rumah Type-36.</w:t>
+        <w:t>Tiga Form Microsoft milik ketua peneliti — satu set untuk semua perusahaan.</w:t>
         <w:br/>
-        <w:t>Jangan menulis nama orang. Nama organisasi diisi — di paper akan disamarkan.</w:t>
+        <w:t>Fasilitator tidak membuat Form. Responden hanya mengklik tautan.</w:t>
       </w:r>
     </w:p>
     <w:p>
@@ -67,7 +67,394 @@
           <w:color w:val="9A4519"/>
           <w:sz w:val="28"/>
         </w:rPr>
-        <w:t>1. Tujuan</w:t>
+        <w:t>1. Siapa yang terlibat</w:t>
+      </w:r>
+    </w:p>
+    <w:tbl>
+      <w:tblPr>
+        <w:tblW w:type="auto" w:w="0"/>
+        <w:jc w:val="center"/>
+        <w:tblLayout w:type="autofit"/>
+        <w:tblLook w:firstColumn="1" w:firstRow="1" w:lastColumn="0" w:lastRow="0" w:noHBand="0" w:noVBand="1" w:val="04A0"/>
+      </w:tblPr>
+      <w:tblGrid>
+        <w:gridCol w:w="3249"/>
+        <w:gridCol w:w="3249"/>
+        <w:gridCol w:w="3249"/>
+      </w:tblGrid>
+      <w:tr>
+        <w:tc>
+          <w:tcPr>
+            <w:tcW w:type="dxa" w:w="3249"/>
+            <w:shd w:fill="C45C26" w:val="clear"/>
+            <w:tcBorders>
+              <w:top w:val="single" w:sz="4" w:color="E8E0D5"/>
+              <w:left w:val="single" w:sz="4" w:color="E8E0D5"/>
+              <w:bottom w:val="single" w:sz="4" w:color="E8E0D5"/>
+              <w:right w:val="single" w:sz="4" w:color="E8E0D5"/>
+            </w:tcBorders>
+          </w:tcPr>
+          <w:p>
+            <w:pPr>
+              <w:spacing w:after="40" w:before="40"/>
+            </w:pPr>
+            <w:r/>
+            <w:r>
+              <w:rPr>
+                <w:rFonts w:ascii="Calibri" w:hAnsi="Calibri" w:eastAsia="Calibri"/>
+                <w:b/>
+                <w:i w:val="0"/>
+                <w:color w:val="FFFFFF"/>
+                <w:sz w:val="20"/>
+              </w:rPr>
+              <w:t>Peran</w:t>
+            </w:r>
+          </w:p>
+        </w:tc>
+        <w:tc>
+          <w:tcPr>
+            <w:tcW w:type="dxa" w:w="3249"/>
+            <w:shd w:fill="C45C26" w:val="clear"/>
+            <w:tcBorders>
+              <w:top w:val="single" w:sz="4" w:color="E8E0D5"/>
+              <w:left w:val="single" w:sz="4" w:color="E8E0D5"/>
+              <w:bottom w:val="single" w:sz="4" w:color="E8E0D5"/>
+              <w:right w:val="single" w:sz="4" w:color="E8E0D5"/>
+            </w:tcBorders>
+          </w:tcPr>
+          <w:p>
+            <w:pPr>
+              <w:spacing w:after="40" w:before="40"/>
+            </w:pPr>
+            <w:r/>
+            <w:r>
+              <w:rPr>
+                <w:rFonts w:ascii="Calibri" w:hAnsi="Calibri" w:eastAsia="Calibri"/>
+                <w:b/>
+                <w:i w:val="0"/>
+                <w:color w:val="FFFFFF"/>
+                <w:sz w:val="20"/>
+              </w:rPr>
+              <w:t>Siapa</w:t>
+            </w:r>
+          </w:p>
+        </w:tc>
+        <w:tc>
+          <w:tcPr>
+            <w:tcW w:type="dxa" w:w="3249"/>
+            <w:shd w:fill="C45C26" w:val="clear"/>
+            <w:tcBorders>
+              <w:top w:val="single" w:sz="4" w:color="E8E0D5"/>
+              <w:left w:val="single" w:sz="4" w:color="E8E0D5"/>
+              <w:bottom w:val="single" w:sz="4" w:color="E8E0D5"/>
+              <w:right w:val="single" w:sz="4" w:color="E8E0D5"/>
+            </w:tcBorders>
+          </w:tcPr>
+          <w:p>
+            <w:pPr>
+              <w:spacing w:after="40" w:before="40"/>
+            </w:pPr>
+            <w:r/>
+            <w:r>
+              <w:rPr>
+                <w:rFonts w:ascii="Calibri" w:hAnsi="Calibri" w:eastAsia="Calibri"/>
+                <w:b/>
+                <w:i w:val="0"/>
+                <w:color w:val="FFFFFF"/>
+                <w:sz w:val="20"/>
+              </w:rPr>
+              <w:t>Tugas</w:t>
+            </w:r>
+          </w:p>
+        </w:tc>
+      </w:tr>
+      <w:tr>
+        <w:tc>
+          <w:tcPr>
+            <w:tcW w:type="dxa" w:w="3249"/>
+            <w:tcBorders>
+              <w:top w:val="single" w:sz="4" w:color="E8E0D5"/>
+              <w:left w:val="single" w:sz="4" w:color="E8E0D5"/>
+              <w:bottom w:val="single" w:sz="4" w:color="E8E0D5"/>
+              <w:right w:val="single" w:sz="4" w:color="E8E0D5"/>
+            </w:tcBorders>
+          </w:tcPr>
+          <w:p>
+            <w:pPr>
+              <w:spacing w:after="40" w:before="40"/>
+            </w:pPr>
+            <w:r/>
+            <w:r>
+              <w:rPr>
+                <w:rFonts w:ascii="Calibri" w:hAnsi="Calibri" w:eastAsia="Calibri"/>
+                <w:b w:val="0"/>
+                <w:i w:val="0"/>
+                <w:color w:val="1C1917"/>
+                <w:sz w:val="20"/>
+              </w:rPr>
+              <w:t>Ketua peneliti</w:t>
+            </w:r>
+          </w:p>
+        </w:tc>
+        <w:tc>
+          <w:tcPr>
+            <w:tcW w:type="dxa" w:w="3249"/>
+            <w:tcBorders>
+              <w:top w:val="single" w:sz="4" w:color="E8E0D5"/>
+              <w:left w:val="single" w:sz="4" w:color="E8E0D5"/>
+              <w:bottom w:val="single" w:sz="4" w:color="E8E0D5"/>
+              <w:right w:val="single" w:sz="4" w:color="E8E0D5"/>
+            </w:tcBorders>
+          </w:tcPr>
+          <w:p>
+            <w:pPr>
+              <w:spacing w:after="40" w:before="40"/>
+            </w:pPr>
+            <w:r/>
+            <w:r>
+              <w:rPr>
+                <w:rFonts w:ascii="Calibri" w:hAnsi="Calibri" w:eastAsia="Calibri"/>
+                <w:b w:val="0"/>
+                <w:i w:val="0"/>
+                <w:color w:val="1C1917"/>
+                <w:sz w:val="20"/>
+              </w:rPr>
+              <w:t>Pemilik paper dan tiga Form Microsoft</w:t>
+            </w:r>
+          </w:p>
+        </w:tc>
+        <w:tc>
+          <w:tcPr>
+            <w:tcW w:type="dxa" w:w="3249"/>
+            <w:tcBorders>
+              <w:top w:val="single" w:sz="4" w:color="E8E0D5"/>
+              <w:left w:val="single" w:sz="4" w:color="E8E0D5"/>
+              <w:bottom w:val="single" w:sz="4" w:color="E8E0D5"/>
+              <w:right w:val="single" w:sz="4" w:color="E8E0D5"/>
+            </w:tcBorders>
+          </w:tcPr>
+          <w:p>
+            <w:pPr>
+              <w:spacing w:after="40" w:before="40"/>
+            </w:pPr>
+            <w:r/>
+            <w:r>
+              <w:rPr>
+                <w:rFonts w:ascii="Calibri" w:hAnsi="Calibri" w:eastAsia="Calibri"/>
+                <w:b w:val="0"/>
+                <w:i w:val="0"/>
+                <w:color w:val="1C1917"/>
+                <w:sz w:val="20"/>
+              </w:rPr>
+              <w:t>Memberi kode sesi dan tautan Form. Menerima isian otomatis. Menyamarkan nama organisasi di paper.</w:t>
+            </w:r>
+          </w:p>
+        </w:tc>
+      </w:tr>
+      <w:tr>
+        <w:tc>
+          <w:tcPr>
+            <w:tcW w:type="dxa" w:w="3249"/>
+            <w:tcBorders>
+              <w:top w:val="single" w:sz="4" w:color="E8E0D5"/>
+              <w:left w:val="single" w:sz="4" w:color="E8E0D5"/>
+              <w:bottom w:val="single" w:sz="4" w:color="E8E0D5"/>
+              <w:right w:val="single" w:sz="4" w:color="E8E0D5"/>
+            </w:tcBorders>
+            <w:shd w:fill="F7F3EE" w:val="clear"/>
+          </w:tcPr>
+          <w:p>
+            <w:pPr>
+              <w:spacing w:after="40" w:before="40"/>
+            </w:pPr>
+            <w:r/>
+            <w:r>
+              <w:rPr>
+                <w:rFonts w:ascii="Calibri" w:hAnsi="Calibri" w:eastAsia="Calibri"/>
+                <w:b w:val="0"/>
+                <w:i w:val="0"/>
+                <w:color w:val="1C1917"/>
+                <w:sz w:val="20"/>
+              </w:rPr>
+              <w:t>Fasilitator</w:t>
+            </w:r>
+          </w:p>
+        </w:tc>
+        <w:tc>
+          <w:tcPr>
+            <w:tcW w:type="dxa" w:w="3249"/>
+            <w:tcBorders>
+              <w:top w:val="single" w:sz="4" w:color="E8E0D5"/>
+              <w:left w:val="single" w:sz="4" w:color="E8E0D5"/>
+              <w:bottom w:val="single" w:sz="4" w:color="E8E0D5"/>
+              <w:right w:val="single" w:sz="4" w:color="E8E0D5"/>
+            </w:tcBorders>
+            <w:shd w:fill="F7F3EE" w:val="clear"/>
+          </w:tcPr>
+          <w:p>
+            <w:pPr>
+              <w:spacing w:after="40" w:before="40"/>
+            </w:pPr>
+            <w:r/>
+            <w:r>
+              <w:rPr>
+                <w:rFonts w:ascii="Calibri" w:hAnsi="Calibri" w:eastAsia="Calibri"/>
+                <w:b w:val="0"/>
+                <w:i w:val="0"/>
+                <w:color w:val="1C1917"/>
+                <w:sz w:val="20"/>
+              </w:rPr>
+              <w:t>Satu orang per perusahaan; rekan penulis</w:t>
+            </w:r>
+          </w:p>
+        </w:tc>
+        <w:tc>
+          <w:tcPr>
+            <w:tcW w:type="dxa" w:w="3249"/>
+            <w:tcBorders>
+              <w:top w:val="single" w:sz="4" w:color="E8E0D5"/>
+              <w:left w:val="single" w:sz="4" w:color="E8E0D5"/>
+              <w:bottom w:val="single" w:sz="4" w:color="E8E0D5"/>
+              <w:right w:val="single" w:sz="4" w:color="E8E0D5"/>
+            </w:tcBorders>
+            <w:shd w:fill="F7F3EE" w:val="clear"/>
+          </w:tcPr>
+          <w:p>
+            <w:pPr>
+              <w:spacing w:after="40" w:before="40"/>
+            </w:pPr>
+            <w:r/>
+            <w:r>
+              <w:rPr>
+                <w:rFonts w:ascii="Calibri" w:hAnsi="Calibri" w:eastAsia="Calibri"/>
+                <w:b w:val="0"/>
+                <w:i w:val="0"/>
+                <w:color w:val="1C1917"/>
+                <w:sz w:val="20"/>
+              </w:rPr>
+              <w:t>Menjalankan sesi 90 menit. Membagikan tautan Form. Mengisi Form 3 (satu per laptop). Mengunduh JSON dan mengirim email. Tidak membuat Form. Tidak mengirim Excel.</w:t>
+            </w:r>
+          </w:p>
+        </w:tc>
+      </w:tr>
+      <w:tr>
+        <w:tc>
+          <w:tcPr>
+            <w:tcW w:type="dxa" w:w="3249"/>
+            <w:tcBorders>
+              <w:top w:val="single" w:sz="4" w:color="E8E0D5"/>
+              <w:left w:val="single" w:sz="4" w:color="E8E0D5"/>
+              <w:bottom w:val="single" w:sz="4" w:color="E8E0D5"/>
+              <w:right w:val="single" w:sz="4" w:color="E8E0D5"/>
+            </w:tcBorders>
+          </w:tcPr>
+          <w:p>
+            <w:pPr>
+              <w:spacing w:after="40" w:before="40"/>
+            </w:pPr>
+            <w:r/>
+            <w:r>
+              <w:rPr>
+                <w:rFonts w:ascii="Calibri" w:hAnsi="Calibri" w:eastAsia="Calibri"/>
+                <w:b w:val="0"/>
+                <w:i w:val="0"/>
+                <w:color w:val="1C1917"/>
+                <w:sz w:val="20"/>
+              </w:rPr>
+              <w:t>Responden</w:t>
+            </w:r>
+          </w:p>
+        </w:tc>
+        <w:tc>
+          <w:tcPr>
+            <w:tcW w:type="dxa" w:w="3249"/>
+            <w:tcBorders>
+              <w:top w:val="single" w:sz="4" w:color="E8E0D5"/>
+              <w:left w:val="single" w:sz="4" w:color="E8E0D5"/>
+              <w:bottom w:val="single" w:sz="4" w:color="E8E0D5"/>
+              <w:right w:val="single" w:sz="4" w:color="E8E0D5"/>
+            </w:tcBorders>
+          </w:tcPr>
+          <w:p>
+            <w:pPr>
+              <w:spacing w:after="40" w:before="40"/>
+            </w:pPr>
+            <w:r/>
+            <w:r>
+              <w:rPr>
+                <w:rFonts w:ascii="Calibri" w:hAnsi="Calibri" w:eastAsia="Calibri"/>
+                <w:b w:val="0"/>
+                <w:i w:val="0"/>
+                <w:color w:val="1C1917"/>
+                <w:sz w:val="20"/>
+              </w:rPr>
+              <w:t>Peserta di perusahaan itu</w:t>
+            </w:r>
+          </w:p>
+        </w:tc>
+        <w:tc>
+          <w:tcPr>
+            <w:tcW w:type="dxa" w:w="3249"/>
+            <w:tcBorders>
+              <w:top w:val="single" w:sz="4" w:color="E8E0D5"/>
+              <w:left w:val="single" w:sz="4" w:color="E8E0D5"/>
+              <w:bottom w:val="single" w:sz="4" w:color="E8E0D5"/>
+              <w:right w:val="single" w:sz="4" w:color="E8E0D5"/>
+            </w:tcBorders>
+          </w:tcPr>
+          <w:p>
+            <w:pPr>
+              <w:spacing w:after="40" w:before="40"/>
+            </w:pPr>
+            <w:r/>
+            <w:r>
+              <w:rPr>
+                <w:rFonts w:ascii="Calibri" w:hAnsi="Calibri" w:eastAsia="Calibri"/>
+                <w:b w:val="0"/>
+                <w:i w:val="0"/>
+                <w:color w:val="1C1917"/>
+                <w:sz w:val="20"/>
+              </w:rPr>
+              <w:t>Mengisi Form 1 sebelum main, Form 2 sesudah main. Boleh sendiri atau beberapa orang di satu laptop.</w:t>
+            </w:r>
+          </w:p>
+        </w:tc>
+      </w:tr>
+    </w:tbl>
+    <w:p>
+      <w:pPr>
+        <w:spacing w:after="160"/>
+      </w:pPr>
+    </w:p>
+    <w:p>
+      <w:pPr>
+        <w:spacing w:after="200" w:before="0" w:line="276" w:lineRule="auto"/>
+      </w:pPr>
+      <w:r>
+        <w:rPr>
+          <w:rFonts w:ascii="Calibri" w:hAnsi="Calibri" w:eastAsia="Calibri"/>
+          <w:b w:val="0"/>
+          <w:i w:val="0"/>
+          <w:color w:val="1C1917"/>
+          <w:sz w:val="22"/>
+        </w:rPr>
+        <w:t>Kontak ketua peneliti: abduh@itb.ac.id.</w:t>
+      </w:r>
+    </w:p>
+    <w:p>
+      <w:pPr>
+        <w:pStyle w:val="Heading1"/>
+        <w:spacing w:before="280" w:after="120"/>
+      </w:pPr>
+      <w:r>
+        <w:rPr>
+          <w:rFonts w:ascii="Calibri" w:hAnsi="Calibri" w:eastAsia="Calibri"/>
+          <w:b/>
+          <w:i w:val="0"/>
+          <w:color w:val="9A4519"/>
+          <w:sz w:val="28"/>
+        </w:rPr>
+        <w:t>2. Tujuan</w:t>
       </w:r>
     </w:p>
     <w:p>
@@ -113,7 +500,7 @@
           <w:color w:val="9A4519"/>
           <w:sz w:val="28"/>
         </w:rPr>
-        <w:t>2. Tiga formulir — jangan digabung</w:t>
+        <w:t>3. Tiga Form — milik ketua peneliti</w:t>
       </w:r>
     </w:p>
     <w:p>
@@ -128,7 +515,7 @@
           <w:color w:val="1C1917"/>
           <w:sz w:val="22"/>
         </w:rPr>
-        <w:t>Pra dan pasca harus tautan terpisah agar “sebelum main” tidak diisi setelah tahu jawabannya. Buat tiga Form Microsoft dari tiga berkas Word di bawah, lalu tempel tautannya sebelum sesi. Draf butir lengkap: SiapKerja_Draft_Kuesioner.docx. Form 1 = 11 butir, Form 2 = 15 butir, Form 3 = 12 butir.</w:t>
+        <w:t>Ada satu Form 1, satu Form 2, dan satu Form 3 untuk semua perusahaan. Data masuk langsung ke akun Microsoft ketua peneliti. Jangan membuat Form baru. Jangan menyalin Form. Jangan merancang soal sendiri. Bagikan tautan yang dikirim ketua peneliti. Tempel tautan di tabel ini sebelum sesi.</w:t>
       </w:r>
     </w:p>
     <w:tbl>
@@ -139,16 +526,15 @@
         <w:tblLook w:firstColumn="1" w:firstRow="1" w:lastColumn="0" w:lastRow="0" w:noHBand="0" w:noVBand="1" w:val="04A0"/>
       </w:tblPr>
       <w:tblGrid>
-        <w:gridCol w:w="1949"/>
-        <w:gridCol w:w="1949"/>
-        <w:gridCol w:w="1949"/>
-        <w:gridCol w:w="1949"/>
-        <w:gridCol w:w="1949"/>
+        <w:gridCol w:w="2436"/>
+        <w:gridCol w:w="2436"/>
+        <w:gridCol w:w="2436"/>
+        <w:gridCol w:w="2436"/>
       </w:tblGrid>
       <w:tr>
         <w:tc>
           <w:tcPr>
-            <w:tcW w:type="dxa" w:w="1949"/>
+            <w:tcW w:type="dxa" w:w="2436"/>
             <w:shd w:fill="C45C26" w:val="clear"/>
             <w:tcBorders>
               <w:top w:val="single" w:sz="4" w:color="E8E0D5"/>
@@ -176,7 +562,7 @@
         </w:tc>
         <w:tc>
           <w:tcPr>
-            <w:tcW w:type="dxa" w:w="1949"/>
+            <w:tcW w:type="dxa" w:w="2436"/>
             <w:shd w:fill="C45C26" w:val="clear"/>
             <w:tcBorders>
               <w:top w:val="single" w:sz="4" w:color="E8E0D5"/>
@@ -198,41 +584,13 @@
                 <w:color w:val="FFFFFF"/>
                 <w:sz w:val="20"/>
               </w:rPr>
-              <w:t>Berkas sumber</w:t>
+              <w:t>Siapa yang mengklik</w:t>
             </w:r>
           </w:p>
         </w:tc>
         <w:tc>
           <w:tcPr>
-            <w:tcW w:type="dxa" w:w="1949"/>
-            <w:shd w:fill="C45C26" w:val="clear"/>
-            <w:tcBorders>
-              <w:top w:val="single" w:sz="4" w:color="E8E0D5"/>
-              <w:left w:val="single" w:sz="4" w:color="E8E0D5"/>
-              <w:bottom w:val="single" w:sz="4" w:color="E8E0D5"/>
-              <w:right w:val="single" w:sz="4" w:color="E8E0D5"/>
-            </w:tcBorders>
-          </w:tcPr>
-          <w:p>
-            <w:pPr>
-              <w:spacing w:after="40" w:before="40"/>
-            </w:pPr>
-            <w:r/>
-            <w:r>
-              <w:rPr>
-                <w:rFonts w:ascii="Calibri" w:hAnsi="Calibri" w:eastAsia="Calibri"/>
-                <w:b/>
-                <w:i w:val="0"/>
-                <w:color w:val="FFFFFF"/>
-                <w:sz w:val="20"/>
-              </w:rPr>
-              <w:t>Siapa</w:t>
-            </w:r>
-          </w:p>
-        </w:tc>
-        <w:tc>
-          <w:tcPr>
-            <w:tcW w:type="dxa" w:w="1949"/>
+            <w:tcW w:type="dxa" w:w="2436"/>
             <w:shd w:fill="C45C26" w:val="clear"/>
             <w:tcBorders>
               <w:top w:val="single" w:sz="4" w:color="E8E0D5"/>
@@ -260,7 +618,7 @@
         </w:tc>
         <w:tc>
           <w:tcPr>
-            <w:tcW w:type="dxa" w:w="1949"/>
+            <w:tcW w:type="dxa" w:w="2436"/>
             <w:shd w:fill="C45C26" w:val="clear"/>
             <w:tcBorders>
               <w:top w:val="single" w:sz="4" w:color="E8E0D5"/>
@@ -282,7 +640,7 @@
                 <w:color w:val="FFFFFF"/>
                 <w:sz w:val="20"/>
               </w:rPr>
-              <w:t>Tautan (isi setelah import)</w:t>
+              <w:t>Tautan (diisi ketua peneliti)</w:t>
             </w:r>
           </w:p>
         </w:tc>
@@ -290,7 +648,7 @@
       <w:tr>
         <w:tc>
           <w:tcPr>
-            <w:tcW w:type="dxa" w:w="1949"/>
+            <w:tcW w:type="dxa" w:w="2436"/>
             <w:tcBorders>
               <w:top w:val="single" w:sz="4" w:color="E8E0D5"/>
               <w:left w:val="single" w:sz="4" w:color="E8E0D5"/>
@@ -311,13 +669,13 @@
                 <w:color w:val="1C1917"/>
                 <w:sz w:val="20"/>
               </w:rPr>
-              <w:t>Form 1 — Pra (11)</w:t>
+              <w:t>Form 1 — Pra</w:t>
             </w:r>
           </w:p>
         </w:tc>
         <w:tc>
           <w:tcPr>
-            <w:tcW w:type="dxa" w:w="1949"/>
+            <w:tcW w:type="dxa" w:w="2436"/>
             <w:tcBorders>
               <w:top w:val="single" w:sz="4" w:color="E8E0D5"/>
               <w:left w:val="single" w:sz="4" w:color="E8E0D5"/>
@@ -338,13 +696,13 @@
                 <w:color w:val="1C1917"/>
                 <w:sz w:val="20"/>
               </w:rPr>
-              <w:t>SiapKerja_MSForms_01_Pra.docx</w:t>
+              <w:t>Setiap responden</w:t>
             </w:r>
           </w:p>
         </w:tc>
         <w:tc>
           <w:tcPr>
-            <w:tcW w:type="dxa" w:w="1949"/>
+            <w:tcW w:type="dxa" w:w="2436"/>
             <w:tcBorders>
               <w:top w:val="single" w:sz="4" w:color="E8E0D5"/>
               <w:left w:val="single" w:sz="4" w:color="E8E0D5"/>
@@ -365,40 +723,13 @@
                 <w:color w:val="1C1917"/>
                 <w:sz w:val="20"/>
               </w:rPr>
-              <w:t>Setiap peserta</w:t>
+              <w:t>Menit 0–8, sebelum laptop simulasi disentuh</w:t>
             </w:r>
           </w:p>
         </w:tc>
         <w:tc>
           <w:tcPr>
-            <w:tcW w:type="dxa" w:w="1949"/>
-            <w:tcBorders>
-              <w:top w:val="single" w:sz="4" w:color="E8E0D5"/>
-              <w:left w:val="single" w:sz="4" w:color="E8E0D5"/>
-              <w:bottom w:val="single" w:sz="4" w:color="E8E0D5"/>
-              <w:right w:val="single" w:sz="4" w:color="E8E0D5"/>
-            </w:tcBorders>
-          </w:tcPr>
-          <w:p>
-            <w:pPr>
-              <w:spacing w:after="40" w:before="40"/>
-            </w:pPr>
-            <w:r/>
-            <w:r>
-              <w:rPr>
-                <w:rFonts w:ascii="Calibri" w:hAnsi="Calibri" w:eastAsia="Calibri"/>
-                <w:b w:val="0"/>
-                <w:i w:val="0"/>
-                <w:color w:val="1C1917"/>
-                <w:sz w:val="20"/>
-              </w:rPr>
-              <w:t>Menit 0–8, sebelum main</w:t>
-            </w:r>
-          </w:p>
-        </w:tc>
-        <w:tc>
-          <w:tcPr>
-            <w:tcW w:type="dxa" w:w="1949"/>
+            <w:tcW w:type="dxa" w:w="2436"/>
             <w:tcBorders>
               <w:top w:val="single" w:sz="4" w:color="E8E0D5"/>
               <w:left w:val="single" w:sz="4" w:color="E8E0D5"/>
@@ -427,7 +758,7 @@
       <w:tr>
         <w:tc>
           <w:tcPr>
-            <w:tcW w:type="dxa" w:w="1949"/>
+            <w:tcW w:type="dxa" w:w="2436"/>
             <w:tcBorders>
               <w:top w:val="single" w:sz="4" w:color="E8E0D5"/>
               <w:left w:val="single" w:sz="4" w:color="E8E0D5"/>
@@ -449,13 +780,13 @@
                 <w:color w:val="1C1917"/>
                 <w:sz w:val="20"/>
               </w:rPr>
-              <w:t>Form 2 — Pasca (15)</w:t>
+              <w:t>Form 2 — Pasca</w:t>
             </w:r>
           </w:p>
         </w:tc>
         <w:tc>
           <w:tcPr>
-            <w:tcW w:type="dxa" w:w="1949"/>
+            <w:tcW w:type="dxa" w:w="2436"/>
             <w:tcBorders>
               <w:top w:val="single" w:sz="4" w:color="E8E0D5"/>
               <w:left w:val="single" w:sz="4" w:color="E8E0D5"/>
@@ -477,41 +808,13 @@
                 <w:color w:val="1C1917"/>
                 <w:sz w:val="20"/>
               </w:rPr>
-              <w:t>SiapKerja_MSForms_02_Pasca.docx</w:t>
+              <w:t>Responden yang sama (sesi + R sama)</w:t>
             </w:r>
           </w:p>
         </w:tc>
         <w:tc>
           <w:tcPr>
-            <w:tcW w:type="dxa" w:w="1949"/>
-            <w:tcBorders>
-              <w:top w:val="single" w:sz="4" w:color="E8E0D5"/>
-              <w:left w:val="single" w:sz="4" w:color="E8E0D5"/>
-              <w:bottom w:val="single" w:sz="4" w:color="E8E0D5"/>
-              <w:right w:val="single" w:sz="4" w:color="E8E0D5"/>
-            </w:tcBorders>
-            <w:shd w:fill="F7F3EE" w:val="clear"/>
-          </w:tcPr>
-          <w:p>
-            <w:pPr>
-              <w:spacing w:after="40" w:before="40"/>
-            </w:pPr>
-            <w:r/>
-            <w:r>
-              <w:rPr>
-                <w:rFonts w:ascii="Calibri" w:hAnsi="Calibri" w:eastAsia="Calibri"/>
-                <w:b w:val="0"/>
-                <w:i w:val="0"/>
-                <w:color w:val="1C1917"/>
-                <w:sz w:val="20"/>
-              </w:rPr>
-              <w:t>Peserta yang sama, sesi + R sama</w:t>
-            </w:r>
-          </w:p>
-        </w:tc>
-        <w:tc>
-          <w:tcPr>
-            <w:tcW w:type="dxa" w:w="1949"/>
+            <w:tcW w:type="dxa" w:w="2436"/>
             <w:tcBorders>
               <w:top w:val="single" w:sz="4" w:color="E8E0D5"/>
               <w:left w:val="single" w:sz="4" w:color="E8E0D5"/>
@@ -539,7 +842,7 @@
         </w:tc>
         <w:tc>
           <w:tcPr>
-            <w:tcW w:type="dxa" w:w="1949"/>
+            <w:tcW w:type="dxa" w:w="2436"/>
             <w:tcBorders>
               <w:top w:val="single" w:sz="4" w:color="E8E0D5"/>
               <w:left w:val="single" w:sz="4" w:color="E8E0D5"/>
@@ -569,7 +872,7 @@
       <w:tr>
         <w:tc>
           <w:tcPr>
-            <w:tcW w:type="dxa" w:w="1949"/>
+            <w:tcW w:type="dxa" w:w="2436"/>
             <w:tcBorders>
               <w:top w:val="single" w:sz="4" w:color="E8E0D5"/>
               <w:left w:val="single" w:sz="4" w:color="E8E0D5"/>
@@ -590,40 +893,13 @@
                 <w:color w:val="1C1917"/>
                 <w:sz w:val="20"/>
               </w:rPr>
-              <w:t>Form 3 — Pengamat (12)</w:t>
+              <w:t>Form 3 — Pengamat</w:t>
             </w:r>
           </w:p>
         </w:tc>
         <w:tc>
           <w:tcPr>
-            <w:tcW w:type="dxa" w:w="1949"/>
-            <w:tcBorders>
-              <w:top w:val="single" w:sz="4" w:color="E8E0D5"/>
-              <w:left w:val="single" w:sz="4" w:color="E8E0D5"/>
-              <w:bottom w:val="single" w:sz="4" w:color="E8E0D5"/>
-              <w:right w:val="single" w:sz="4" w:color="E8E0D5"/>
-            </w:tcBorders>
-          </w:tcPr>
-          <w:p>
-            <w:pPr>
-              <w:spacing w:after="40" w:before="40"/>
-            </w:pPr>
-            <w:r/>
-            <w:r>
-              <w:rPr>
-                <w:rFonts w:ascii="Calibri" w:hAnsi="Calibri" w:eastAsia="Calibri"/>
-                <w:b w:val="0"/>
-                <w:i w:val="0"/>
-                <w:color w:val="1C1917"/>
-                <w:sz w:val="20"/>
-              </w:rPr>
-              <w:t>SiapKerja_MSForms_03_Pengamat.docx</w:t>
-            </w:r>
-          </w:p>
-        </w:tc>
-        <w:tc>
-          <w:tcPr>
-            <w:tcW w:type="dxa" w:w="1949"/>
+            <w:tcW w:type="dxa" w:w="2436"/>
             <w:tcBorders>
               <w:top w:val="single" w:sz="4" w:color="E8E0D5"/>
               <w:left w:val="single" w:sz="4" w:color="E8E0D5"/>
@@ -650,7 +926,7 @@
         </w:tc>
         <w:tc>
           <w:tcPr>
-            <w:tcW w:type="dxa" w:w="1949"/>
+            <w:tcW w:type="dxa" w:w="2436"/>
             <w:tcBorders>
               <w:top w:val="single" w:sz="4" w:color="E8E0D5"/>
               <w:left w:val="single" w:sz="4" w:color="E8E0D5"/>
@@ -677,7 +953,7 @@
         </w:tc>
         <w:tc>
           <w:tcPr>
-            <w:tcW w:type="dxa" w:w="1949"/>
+            <w:tcW w:type="dxa" w:w="2436"/>
             <w:tcBorders>
               <w:top w:val="single" w:sz="4" w:color="E8E0D5"/>
               <w:left w:val="single" w:sz="4" w:color="E8E0D5"/>
@@ -711,7 +987,7 @@
     </w:p>
     <w:p>
       <w:pPr>
-        <w:spacing w:after="160" w:before="0" w:line="276" w:lineRule="auto"/>
+        <w:spacing w:after="200" w:before="0" w:line="276" w:lineRule="auto"/>
       </w:pPr>
       <w:r>
         <w:rPr>
@@ -721,7 +997,7 @@
           <w:color w:val="57534E"/>
           <w:sz w:val="20"/>
         </w:rPr>
-        <w:t>Cara import: forms.office.com → New Form (bukan Quiz) → Quick import / From Word → pilih berkas. Set Required pada kode sesi, kode R, kode G, dan nama organisasi. Matikan penskoran. Lihat SiapKerja_MSForms_CaraUnggah.md.</w:t>
+        <w:t>Form 1 dan Form 2 terpisah agar “sebelum main” tidak diisi setelah tahu jawabannya. Isian responden tidak lewat fasilitator — mereka mengklik tautan, data sampai ke ketua peneliti.</w:t>
       </w:r>
     </w:p>
     <w:p>
@@ -737,7 +1013,7 @@
           <w:color w:val="9A4519"/>
           <w:sz w:val="28"/>
         </w:rPr>
-        <w:t>3. Kode — agar Excel tidak menumpuk</w:t>
+        <w:t>4. Kode — agar Excel tidak menumpuk</w:t>
       </w:r>
     </w:p>
     <w:p>
@@ -752,7 +1028,7 @@
           <w:color w:val="1C1917"/>
           <w:sz w:val="22"/>
         </w:rPr>
-        <w:t>Kalau dua perusahaan sama-sama mengisi R01, baris Excel akan menumpuk dan pra–pasca tidak bisa dipasangkan. Pakai tiga kode plus nama organisasi. Gabung Form 1 dan Form 2 lewat kolom sesi + R.</w:t>
+        <w:t>Ketua peneliti memberi Anda kode sesi sebelum hari-H. Pakai kode itu. Jangan membuat kode sesi sendiri. Anda yang membagikan R dan G kepada responden di sesi Anda.</w:t>
       </w:r>
     </w:p>
     <w:tbl>
@@ -877,7 +1153,7 @@
                 <w:color w:val="FFFFFF"/>
                 <w:sz w:val="20"/>
               </w:rPr>
-              <w:t>Catatan</w:t>
+              <w:t>Siapa yang memberi</w:t>
             </w:r>
           </w:p>
         </w:tc>
@@ -933,7 +1209,7 @@
                 <w:color w:val="1C1917"/>
                 <w:sz w:val="20"/>
               </w:rPr>
-              <w:t>Satu undangan / satu perusahaan / satu hari</w:t>
+              <w:t>Satu perusahaan / satu hari uji coba</w:t>
             </w:r>
           </w:p>
         </w:tc>
@@ -987,7 +1263,7 @@
                 <w:color w:val="1C1917"/>
                 <w:sz w:val="20"/>
               </w:rPr>
-              <w:t>Huruf A, B, … jika ada dua sesi di hari yang sama</w:t>
+              <w:t>Ketua peneliti, ke fasilitator</w:t>
             </w:r>
           </w:p>
         </w:tc>
@@ -1101,7 +1377,7 @@
                 <w:color w:val="1C1917"/>
                 <w:sz w:val="20"/>
               </w:rPr>
-              <w:t>Jangan ganti G menjadi nama perusahaan</w:t>
+              <w:t>Fasilitator</w:t>
             </w:r>
           </w:p>
         </w:tc>
@@ -1211,7 +1487,7 @@
                 <w:color w:val="1C1917"/>
                 <w:sz w:val="20"/>
               </w:rPr>
-              <w:t>Jangan ulang R01 di G2 dalam sesi yang sama</w:t>
+              <w:t>Fasilitator</w:t>
             </w:r>
           </w:p>
         </w:tc>
@@ -1297,7 +1573,7 @@
                 <w:color w:val="1C1917"/>
                 <w:sz w:val="20"/>
               </w:rPr>
-              <w:t>PT … / Kampus … / Individu</w:t>
+              <w:t>nama perusahaan / Individu</w:t>
             </w:r>
           </w:p>
         </w:tc>
@@ -1325,7 +1601,7 @@
                 <w:color w:val="1C1917"/>
                 <w:sz w:val="20"/>
               </w:rPr>
-              <w:t>Hanya disamarkan di paper, bukan di Form</w:t>
+              <w:t>Responden (Form 1) dan fasilitator (Form 3)</w:t>
             </w:r>
           </w:p>
         </w:tc>
@@ -1348,7 +1624,7 @@
           <w:color w:val="1C1917"/>
           <w:sz w:val="22"/>
         </w:rPr>
-        <w:t>R jangan diulang per kelompok. Dalam satu sesi, R01 hanya satu orang meski ada G1 dan G2. Nama orang tidak ditulis di mana pun.</w:t>
+        <w:t>R jangan diulang per laptop. Dalam satu sesi, R01 hanya satu orang meski ada G1 dan G2. Nama orang tidak ditulis di mana pun. Nama organisasi diisi, disamarkan di paper. Gabung pra–pasca di Excel urusan ketua peneliti (kolom sesi + R).</w:t>
       </w:r>
     </w:p>
     <w:p>
@@ -1364,13 +1640,12 @@
           <w:color w:val="9A4519"/>
           <w:sz w:val="28"/>
         </w:rPr>
-        <w:t>4. Persiapan (sehari sebelum)</w:t>
+        <w:t>5. Laptop dan peserta</w:t>
       </w:r>
     </w:p>
     <w:p>
       <w:pPr>
-        <w:pStyle w:val="ListNumber"/>
-        <w:spacing w:after="60"/>
+        <w:spacing w:after="160" w:before="0" w:line="276" w:lineRule="auto"/>
       </w:pPr>
       <w:r>
         <w:rPr>
@@ -1380,13 +1655,12 @@
           <w:color w:val="1C1917"/>
           <w:sz w:val="22"/>
         </w:rPr>
-        <w:t>Siapkan 1 laptop per kelompok. Chrome atau Edge. Buka SiapKerja! sekali saat masih ada sinyal agar tersimpan di browser.</w:t>
+        <w:t>Satu laptop = satu kelompok (kode G). Boleh satu orang di laptop itu, boleh beberapa, asal satu laptop. Jika ada dua laptop, itu G1 dan G2 — dua isian Form 3, dua file JSON.</w:t>
       </w:r>
     </w:p>
     <w:p>
       <w:pPr>
-        <w:pStyle w:val="ListNumber"/>
-        <w:spacing w:after="60"/>
+        <w:spacing w:after="160" w:before="0" w:line="276" w:lineRule="auto"/>
       </w:pPr>
       <w:r>
         <w:rPr>
@@ -1396,7 +1670,7 @@
           <w:color w:val="1C1917"/>
           <w:sz w:val="22"/>
         </w:rPr>
-        <w:t>Kunci setelan — semua kelompok, semua sesi, tidak boleh diganti:</w:t>
+        <w:t>Setelan simulasi — semua laptop, tidak boleh diganti:</w:t>
       </w:r>
     </w:p>
     <w:tbl>
@@ -1760,18 +2034,18 @@
     </w:p>
     <w:p>
       <w:pPr>
-        <w:pStyle w:val="ListNumber"/>
-        <w:spacing w:after="60"/>
+        <w:pStyle w:val="Heading1"/>
+        <w:spacing w:before="280" w:after="120"/>
       </w:pPr>
       <w:r>
         <w:rPr>
           <w:rFonts w:ascii="Calibri" w:hAnsi="Calibri" w:eastAsia="Calibri"/>
-          <w:b w:val="0"/>
+          <w:b/>
           <w:i w:val="0"/>
-          <w:color w:val="1C1917"/>
-          <w:sz w:val="22"/>
+          <w:color w:val="9A4519"/>
+          <w:sz w:val="28"/>
         </w:rPr>
-        <w:t>Tetapkan kode sesi untuk undangan ini. Cetak kartu: tiap orang satu R (unik dalam sesi), tiap laptop satu G. Form 1 dan Form 2 memakai sesi + R yang sama.</w:t>
+        <w:t>6. Persiapan (sehari sebelum)</w:t>
       </w:r>
     </w:p>
     <w:p>
@@ -1787,7 +2061,7 @@
           <w:color w:val="1C1917"/>
           <w:sz w:val="22"/>
         </w:rPr>
-        <w:t>Uji tautan ketiga Form. Form = survei, bukan kuis berpoin.</w:t>
+        <w:t>Terima dari ketua peneliti: kode sesi, tiga tautan Form, pedoman ini.</w:t>
       </w:r>
     </w:p>
     <w:p>
@@ -1803,7 +2077,7 @@
           <w:color w:val="1C1917"/>
           <w:sz w:val="22"/>
         </w:rPr>
-        <w:t>Undangan: 6–12 orang per sesi, 2–4 kelompok. Siapa pun yang perlu berlatih LPS. Beberapa sesi boleh dijumlahkan di paper (nama organisasi disamarkan).</w:t>
+        <w:t>Uji ketiga tautan (buka, pastikan Form 1 / 2 / 3). Jangan mengubah soal.</w:t>
       </w:r>
     </w:p>
     <w:p>
@@ -1819,7 +2093,7 @@
           <w:color w:val="1C1917"/>
           <w:sz w:val="22"/>
         </w:rPr>
-        <w:t>Satu pengamat (Anda atau asisten) mengisi Form 3, bukan peserta.</w:t>
+        <w:t>Siapkan laptop. Chrome atau Edge. Buka SiapKerja! sekali saat masih ada sinyal agar tersimpan di browser.</w:t>
       </w:r>
     </w:p>
     <w:p>
@@ -1835,7 +2109,55 @@
           <w:color w:val="1C1917"/>
           <w:sz w:val="22"/>
         </w:rPr>
-        <w:t>Undangan dan slide hanya menjelaskan SiapKerja dan LPS yang akan dijalankan.</w:t>
+        <w:t>Kunci setelan 2 / 8 / standar / waktu / LOD standar.</w:t>
+      </w:r>
+    </w:p>
+    <w:p>
+      <w:pPr>
+        <w:pStyle w:val="ListNumber"/>
+        <w:spacing w:after="60"/>
+      </w:pPr>
+      <w:r>
+        <w:rPr>
+          <w:rFonts w:ascii="Calibri" w:hAnsi="Calibri" w:eastAsia="Calibri"/>
+          <w:b w:val="0"/>
+          <w:i w:val="0"/>
+          <w:color w:val="1C1917"/>
+          <w:sz w:val="22"/>
+        </w:rPr>
+        <w:t>Tulis kartu: tiap orang satu R (unik dalam sesi), tiap laptop satu G.</w:t>
+      </w:r>
+    </w:p>
+    <w:p>
+      <w:pPr>
+        <w:pStyle w:val="ListNumber"/>
+        <w:spacing w:after="60"/>
+      </w:pPr>
+      <w:r>
+        <w:rPr>
+          <w:rFonts w:ascii="Calibri" w:hAnsi="Calibri" w:eastAsia="Calibri"/>
+          <w:b w:val="0"/>
+          <w:i w:val="0"/>
+          <w:color w:val="1C1917"/>
+          <w:sz w:val="22"/>
+        </w:rPr>
+        <w:t>Undangan: siapa pun yang perlu berlatih LPS. Jumlah fleksibel.</w:t>
+      </w:r>
+    </w:p>
+    <w:p>
+      <w:pPr>
+        <w:pStyle w:val="ListNumber"/>
+        <w:spacing w:after="60"/>
+      </w:pPr>
+      <w:r>
+        <w:rPr>
+          <w:rFonts w:ascii="Calibri" w:hAnsi="Calibri" w:eastAsia="Calibri"/>
+          <w:b w:val="0"/>
+          <w:i w:val="0"/>
+          <w:color w:val="1C1917"/>
+          <w:sz w:val="22"/>
+        </w:rPr>
+        <w:t>Anda mengisi Form 3, bukan responden.</w:t>
       </w:r>
     </w:p>
     <w:p>
@@ -1851,7 +2173,7 @@
           <w:color w:val="9A4519"/>
           <w:sz w:val="28"/>
         </w:rPr>
-        <w:t>5. Alur 90 menit</w:t>
+        <w:t>7. Alur 90 menit</w:t>
       </w:r>
     </w:p>
     <w:tbl>
@@ -2003,7 +2325,7 @@
                 <w:color w:val="1C1917"/>
                 <w:sz w:val="20"/>
               </w:rPr>
-              <w:t>Consent (bacakan butir 8) + peserta mengisi Form 1. Laptop simulasi belum disentuh.</w:t>
+              <w:t>Consent (bacakan butir 10) + responden mengklik tautan Form 1. Laptop simulasi belum disentuh.</w:t>
             </w:r>
           </w:p>
         </w:tc>
@@ -2257,7 +2579,7 @@
                 <w:color w:val="1C1917"/>
                 <w:sz w:val="20"/>
               </w:rPr>
-              <w:t>Hanya fasilitator: unduh JSON (tombol Unduh sesi), ganti nama {sesi}-G{n}.json, kirim email ke abduh@itb.ac.id. Bukan tugas peserta.</w:t>
+              <w:t>Fasilitator unduh JSON (tombol Unduh sesi), nama {sesi}-G{n}.json, kirim ke abduh@itb.ac.id. Bukan tugas responden.</w:t>
             </w:r>
           </w:p>
         </w:tc>
@@ -2341,7 +2663,7 @@
                 <w:color w:val="1C1917"/>
                 <w:sz w:val="20"/>
               </w:rPr>
-              <w:t>Peserta mengisi Form 2 dengan kode sesi + R yang sama seperti Form 1.</w:t>
+              <w:t>Responden mengklik tautan Form 2 dengan kode sesi + R yang sama seperti Form 1.</w:t>
             </w:r>
           </w:p>
         </w:tc>
@@ -2407,7 +2729,7 @@
           <w:color w:val="9A4519"/>
           <w:sz w:val="28"/>
         </w:rPr>
-        <w:t>6. File JSON — hanya fasilitator</w:t>
+        <w:t>8. File JSON — hanya fasilitator</w:t>
       </w:r>
     </w:p>
     <w:p>
@@ -2422,7 +2744,7 @@
           <w:color w:val="1C1917"/>
           <w:sz w:val="22"/>
         </w:rPr>
-        <w:t>Tombol Unduh sesi menyimpan save file simulator (pilihan pemilik, pull, L1, WWP, huddle, PPC). Tidak ada nama orang. Bukan jawaban kuesioner. Tidak dipakai untuk memasangkan pra–pasca (itu urusan sesi + R di Form 1 dan Form 2).</w:t>
+        <w:t>Tombol Unduh sesi menyimpan save file simulator (pilihan pemilik, pull, L1, WWP, huddle, PPC). Tidak ada nama orang. Bukan jawaban kuesioner. Jawaban kuesioner sudah masuk Form ketua peneliti.</w:t>
       </w:r>
     </w:p>
     <w:p>
@@ -2437,7 +2759,7 @@
           <w:color w:val="1C1917"/>
           <w:sz w:val="22"/>
         </w:rPr>
-        <w:t>Yang dilakukan fasilitator, menit 75–80:</w:t>
+        <w:t>Menit 75–80:</w:t>
       </w:r>
     </w:p>
     <w:p>
@@ -2485,7 +2807,7 @@
           <w:color w:val="1C1917"/>
           <w:sz w:val="22"/>
         </w:rPr>
-        <w:t>Kirim email ke abduh@itb.ac.id, subjek: SiapKerja JSON {sesi}-G{n}. Lampirkan file JSON. Boleh kirim sekaligus semua G dalam satu email.</w:t>
+        <w:t>Kirim email ke abduh@itb.ac.id, subjek: SiapKerja JSON {sesi}-G{n}. Lampirkan file. Boleh semua G dalam satu email.</w:t>
       </w:r>
     </w:p>
     <w:p>
@@ -2501,7 +2823,7 @@
           <w:color w:val="1C1917"/>
           <w:sz w:val="22"/>
         </w:rPr>
-        <w:t>Tulis nama file itu di Form 3 butir 11. Jika belum sempat, tulis belum — Excel Form tetap dipakai.</w:t>
+        <w:t>Tulis nama file itu di Form 3. Jika belum sempat, tulis belum.</w:t>
       </w:r>
     </w:p>
     <w:p>
@@ -2516,7 +2838,7 @@
           <w:color w:val="1C1917"/>
           <w:sz w:val="22"/>
         </w:rPr>
-        <w:t>Jangan minta peserta mengunduh atau mengirim JSON. Jangan lampirkan daftar hadir bernama.</w:t>
+        <w:t>Jangan minta responden mengunduh atau mengirim JSON. Jangan lampirkan daftar hadir bernama. Jangan mengirim Excel — Excel sudah di akun ketua peneliti.</w:t>
       </w:r>
     </w:p>
     <w:p>
@@ -2532,7 +2854,7 @@
           <w:color w:val="9A4519"/>
           <w:sz w:val="28"/>
         </w:rPr>
-        <w:t>7. Peran di tiap kelompok</w:t>
+        <w:t>9. Jika beberapa orang di satu laptop</w:t>
       </w:r>
     </w:p>
     <w:p>
@@ -2547,7 +2869,7 @@
           <w:color w:val="1C1917"/>
           <w:sz w:val="22"/>
         </w:rPr>
-        <w:t>Ideal 5 orang di satu laptop. Jika 3–4, gabung peran.</w:t>
+        <w:t>Ideal 5 orang. Jika 3–4, gabung peran. Jika 1 orang, orang itu menjalankan semua tab.</w:t>
       </w:r>
     </w:p>
     <w:tbl>
@@ -2643,7 +2965,7 @@
                 <w:color w:val="1C1917"/>
                 <w:sz w:val="20"/>
               </w:rPr>
-              <w:t>Fasilitator kelompok</w:t>
+              <w:t>Fasilitator laptop</w:t>
             </w:r>
           </w:p>
         </w:tc>
@@ -2922,7 +3244,7 @@
           <w:color w:val="9A4519"/>
           <w:sz w:val="28"/>
         </w:rPr>
-        <w:t>8. Yang tidak dilakukan</w:t>
+        <w:t>10. Yang tidak dilakukan</w:t>
       </w:r>
     </w:p>
     <w:p>
@@ -2938,7 +3260,39 @@
           <w:color w:val="1C1917"/>
           <w:sz w:val="22"/>
         </w:rPr>
-        <w:t>Jangan meranking kelompok.</w:t>
+        <w:t>Jangan membuat Form Microsoft sendiri, jangan menyalin Form, jangan menambah soal.</w:t>
+      </w:r>
+    </w:p>
+    <w:p>
+      <w:pPr>
+        <w:pStyle w:val="ListBullet"/>
+        <w:spacing w:after="60" w:line="276" w:lineRule="auto"/>
+      </w:pPr>
+      <w:r>
+        <w:rPr>
+          <w:rFonts w:ascii="Calibri" w:hAnsi="Calibri" w:eastAsia="Calibri"/>
+          <w:b w:val="0"/>
+          <w:i w:val="0"/>
+          <w:color w:val="1C1917"/>
+          <w:sz w:val="22"/>
+        </w:rPr>
+        <w:t>Jangan mengirim Excel — isian sudah masuk ke ketua peneliti.</w:t>
+      </w:r>
+    </w:p>
+    <w:p>
+      <w:pPr>
+        <w:pStyle w:val="ListBullet"/>
+        <w:spacing w:after="60" w:line="276" w:lineRule="auto"/>
+      </w:pPr>
+      <w:r>
+        <w:rPr>
+          <w:rFonts w:ascii="Calibri" w:hAnsi="Calibri" w:eastAsia="Calibri"/>
+          <w:b w:val="0"/>
+          <w:i w:val="0"/>
+          <w:color w:val="1C1917"/>
+          <w:sz w:val="22"/>
+        </w:rPr>
+        <w:t>Jangan meranking laptop atau responden.</w:t>
       </w:r>
     </w:p>
     <w:p>
@@ -2970,7 +3324,7 @@
           <w:color w:val="1C1917"/>
           <w:sz w:val="22"/>
         </w:rPr>
-        <w:t>Jangan mengisi formulir untuk orang lain.</w:t>
+        <w:t>Jangan mengisi Form 1 atau Form 2 untuk orang lain.</w:t>
       </w:r>
     </w:p>
     <w:p>
@@ -3018,7 +3372,23 @@
           <w:color w:val="1C1917"/>
           <w:sz w:val="22"/>
         </w:rPr>
-        <w:t>Jangan minta peserta mengunduh JSON.</w:t>
+        <w:t>Jangan minta responden mengunduh JSON.</w:t>
+      </w:r>
+    </w:p>
+    <w:p>
+      <w:pPr>
+        <w:pStyle w:val="ListBullet"/>
+        <w:spacing w:after="60" w:line="276" w:lineRule="auto"/>
+      </w:pPr>
+      <w:r>
+        <w:rPr>
+          <w:rFonts w:ascii="Calibri" w:hAnsi="Calibri" w:eastAsia="Calibri"/>
+          <w:b w:val="0"/>
+          <w:i w:val="0"/>
+          <w:color w:val="1C1917"/>
+          <w:sz w:val="22"/>
+        </w:rPr>
+        <w:t>Jangan membuat kode sesi sendiri — pakai yang diberi ketua peneliti.</w:t>
       </w:r>
     </w:p>
     <w:p>
@@ -3034,7 +3404,7 @@
           <w:color w:val="9A4519"/>
           <w:sz w:val="28"/>
         </w:rPr>
-        <w:t>9. Teks consent (dibacakan menit 0)</w:t>
+        <w:t>11. Teks consent (dibacakan menit 0)</w:t>
       </w:r>
     </w:p>
     <w:p>
@@ -3049,7 +3419,7 @@
           <w:color w:val="1C1917"/>
           <w:sz w:val="22"/>
         </w:rPr>
-        <w:t>“Ini uji coba SiapKerja, alat ajar Last Planner System, untuk paper akademik. Kami mengevaluasi aplikasi ini, bukan menilai Anda atau organisasi Anda. Jangan tulis nama orang. Nama organisasi diisi apa adanya dan akan disamarkan di paper. Partisipasi sukarela, boleh berhenti kapan saja. File sesi simulator tidak berisi nama orang. Data dipakai untuk menyempurnakan SiapKerja sebagai pembelajaran LPS.”</w:t>
+        <w:t>“Ini uji coba SiapKerja, alat ajar Last Planner System, untuk paper akademik. Kami mengevaluasi aplikasi ini, bukan menilai Anda atau organisasi Anda. Jangan tulis nama orang. Nama organisasi diisi apa adanya dan akan disamarkan di paper. Partisipasi sukarela, boleh berhenti kapan saja. Isian Form masuk ke ketua peneliti. File sesi simulator tidak berisi nama orang. Data dipakai untuk menyempurnakan SiapKerja sebagai pembelajaran LPS.”</w:t>
       </w:r>
     </w:p>
     <w:p>
@@ -3065,7 +3435,7 @@
           <w:color w:val="9A4519"/>
           <w:sz w:val="28"/>
         </w:rPr>
-        <w:t>10. Brief 7 menit — yang dikatakan</w:t>
+        <w:t>12. Brief 7 menit — yang dikatakan</w:t>
       </w:r>
     </w:p>
     <w:p>
@@ -3207,7 +3577,7 @@
           <w:color w:val="1C1917"/>
           <w:sz w:val="22"/>
         </w:rPr>
-        <w:t>Jangan memuji kelompok yang lebih cepat mencapai 100% rumah. PPC dan alasan variansi yang dibahas, bukan siapa selesai dulu.</w:t>
+        <w:t>Jangan memuji yang lebih cepat mencapai 100% rumah. PPC dan alasan variansi yang dibahas, bukan siapa selesai dulu.</w:t>
       </w:r>
     </w:p>
     <w:p>
@@ -3223,7 +3593,7 @@
           <w:color w:val="9A4519"/>
           <w:sz w:val="28"/>
         </w:rPr>
-        <w:t>11. Setelah sesi — yang dikumpulkan</w:t>
+        <w:t>13. Setelah sesi</w:t>
       </w:r>
     </w:p>
     <w:tbl>
@@ -3234,14 +3604,13 @@
         <w:tblLook w:firstColumn="1" w:firstRow="1" w:lastColumn="0" w:lastRow="0" w:noHBand="0" w:noVBand="1" w:val="04A0"/>
       </w:tblPr>
       <w:tblGrid>
-        <w:gridCol w:w="3249"/>
-        <w:gridCol w:w="3249"/>
-        <w:gridCol w:w="3249"/>
+        <w:gridCol w:w="4873"/>
+        <w:gridCol w:w="4873"/>
       </w:tblGrid>
       <w:tr>
         <w:tc>
           <w:tcPr>
-            <w:tcW w:type="dxa" w:w="3249"/>
+            <w:tcW w:type="dxa" w:w="4873"/>
             <w:shd w:fill="C45C26" w:val="clear"/>
             <w:tcBorders>
               <w:top w:val="single" w:sz="4" w:color="E8E0D5"/>
@@ -3263,13 +3632,13 @@
                 <w:color w:val="FFFFFF"/>
                 <w:sz w:val="20"/>
               </w:rPr>
-              <w:t>Berkas</w:t>
+              <w:t>Apa</w:t>
             </w:r>
           </w:p>
         </w:tc>
         <w:tc>
           <w:tcPr>
-            <w:tcW w:type="dxa" w:w="3249"/>
+            <w:tcW w:type="dxa" w:w="4873"/>
             <w:shd w:fill="C45C26" w:val="clear"/>
             <w:tcBorders>
               <w:top w:val="single" w:sz="4" w:color="E8E0D5"/>
@@ -3291,35 +3660,7 @@
                 <w:color w:val="FFFFFF"/>
                 <w:sz w:val="20"/>
               </w:rPr>
-              <w:t>Dari mana</w:t>
-            </w:r>
-          </w:p>
-        </w:tc>
-        <w:tc>
-          <w:tcPr>
-            <w:tcW w:type="dxa" w:w="3249"/>
-            <w:shd w:fill="C45C26" w:val="clear"/>
-            <w:tcBorders>
-              <w:top w:val="single" w:sz="4" w:color="E8E0D5"/>
-              <w:left w:val="single" w:sz="4" w:color="E8E0D5"/>
-              <w:bottom w:val="single" w:sz="4" w:color="E8E0D5"/>
-              <w:right w:val="single" w:sz="4" w:color="E8E0D5"/>
-            </w:tcBorders>
-          </w:tcPr>
-          <w:p>
-            <w:pPr>
-              <w:spacing w:after="40" w:before="40"/>
-            </w:pPr>
-            <w:r/>
-            <w:r>
-              <w:rPr>
-                <w:rFonts w:ascii="Calibri" w:hAnsi="Calibri" w:eastAsia="Calibri"/>
-                <w:b/>
-                <w:i w:val="0"/>
-                <w:color w:val="FFFFFF"/>
-                <w:sz w:val="20"/>
-              </w:rPr>
-              <w:t>Nama / isi</w:t>
+              <w:t>Siapa yang mengurus</w:t>
             </w:r>
           </w:p>
         </w:tc>
@@ -3327,7 +3668,7 @@
       <w:tr>
         <w:tc>
           <w:tcPr>
-            <w:tcW w:type="dxa" w:w="3249"/>
+            <w:tcW w:type="dxa" w:w="4873"/>
             <w:tcBorders>
               <w:top w:val="single" w:sz="4" w:color="E8E0D5"/>
               <w:left w:val="single" w:sz="4" w:color="E8E0D5"/>
@@ -3348,13 +3689,13 @@
                 <w:color w:val="1C1917"/>
                 <w:sz w:val="20"/>
               </w:rPr>
-              <w:t>Excel Form 1</w:t>
+              <w:t>Isian Form 1, 2, 3</w:t>
             </w:r>
           </w:p>
         </w:tc>
         <w:tc>
           <w:tcPr>
-            <w:tcW w:type="dxa" w:w="3249"/>
+            <w:tcW w:type="dxa" w:w="4873"/>
             <w:tcBorders>
               <w:top w:val="single" w:sz="4" w:color="E8E0D5"/>
               <w:left w:val="single" w:sz="4" w:color="E8E0D5"/>
@@ -3375,34 +3716,7 @@
                 <w:color w:val="1C1917"/>
                 <w:sz w:val="20"/>
               </w:rPr>
-              <w:t>Forms → Open in Excel</w:t>
-            </w:r>
-          </w:p>
-        </w:tc>
-        <w:tc>
-          <w:tcPr>
-            <w:tcW w:type="dxa" w:w="3249"/>
-            <w:tcBorders>
-              <w:top w:val="single" w:sz="4" w:color="E8E0D5"/>
-              <w:left w:val="single" w:sz="4" w:color="E8E0D5"/>
-              <w:bottom w:val="single" w:sz="4" w:color="E8E0D5"/>
-              <w:right w:val="single" w:sz="4" w:color="E8E0D5"/>
-            </w:tcBorders>
-          </w:tcPr>
-          <w:p>
-            <w:pPr>
-              <w:spacing w:after="40" w:before="40"/>
-            </w:pPr>
-            <w:r/>
-            <w:r>
-              <w:rPr>
-                <w:rFonts w:ascii="Calibri" w:hAnsi="Calibri" w:eastAsia="Calibri"/>
-                <w:b w:val="0"/>
-                <w:i w:val="0"/>
-                <w:color w:val="1C1917"/>
-                <w:sz w:val="20"/>
-              </w:rPr>
-              <w:t>Pra; gabung lewat sesi + R</w:t>
+              <w:t>Sudah di akun Microsoft ketua peneliti. Fasilitator tidak mengirim Excel.</w:t>
             </w:r>
           </w:p>
         </w:tc>
@@ -3410,7 +3724,7 @@
       <w:tr>
         <w:tc>
           <w:tcPr>
-            <w:tcW w:type="dxa" w:w="3249"/>
+            <w:tcW w:type="dxa" w:w="4873"/>
             <w:tcBorders>
               <w:top w:val="single" w:sz="4" w:color="E8E0D5"/>
               <w:left w:val="single" w:sz="4" w:color="E8E0D5"/>
@@ -3432,13 +3746,13 @@
                 <w:color w:val="1C1917"/>
                 <w:sz w:val="20"/>
               </w:rPr>
-              <w:t>Excel Form 2</w:t>
+              <w:t>JSON simulator {sesi}-G{n}.json</w:t>
             </w:r>
           </w:p>
         </w:tc>
         <w:tc>
           <w:tcPr>
-            <w:tcW w:type="dxa" w:w="3249"/>
+            <w:tcW w:type="dxa" w:w="4873"/>
             <w:tcBorders>
               <w:top w:val="single" w:sz="4" w:color="E8E0D5"/>
               <w:left w:val="single" w:sz="4" w:color="E8E0D5"/>
@@ -3460,35 +3774,7 @@
                 <w:color w:val="1C1917"/>
                 <w:sz w:val="20"/>
               </w:rPr>
-              <w:t>Forms → Open in Excel</w:t>
-            </w:r>
-          </w:p>
-        </w:tc>
-        <w:tc>
-          <w:tcPr>
-            <w:tcW w:type="dxa" w:w="3249"/>
-            <w:tcBorders>
-              <w:top w:val="single" w:sz="4" w:color="E8E0D5"/>
-              <w:left w:val="single" w:sz="4" w:color="E8E0D5"/>
-              <w:bottom w:val="single" w:sz="4" w:color="E8E0D5"/>
-              <w:right w:val="single" w:sz="4" w:color="E8E0D5"/>
-            </w:tcBorders>
-            <w:shd w:fill="F7F3EE" w:val="clear"/>
-          </w:tcPr>
-          <w:p>
-            <w:pPr>
-              <w:spacing w:after="40" w:before="40"/>
-            </w:pPr>
-            <w:r/>
-            <w:r>
-              <w:rPr>
-                <w:rFonts w:ascii="Calibri" w:hAnsi="Calibri" w:eastAsia="Calibri"/>
-                <w:b w:val="0"/>
-                <w:i w:val="0"/>
-                <w:color w:val="1C1917"/>
-                <w:sz w:val="20"/>
-              </w:rPr>
-              <w:t>Pasca; gabung ke Form 1 lewat sesi + R</w:t>
+              <w:t>Fasilitator kirim email ke abduh@itb.ac.id</w:t>
             </w:r>
           </w:p>
         </w:tc>
@@ -3496,7 +3782,7 @@
       <w:tr>
         <w:tc>
           <w:tcPr>
-            <w:tcW w:type="dxa" w:w="3249"/>
+            <w:tcW w:type="dxa" w:w="4873"/>
             <w:tcBorders>
               <w:top w:val="single" w:sz="4" w:color="E8E0D5"/>
               <w:left w:val="single" w:sz="4" w:color="E8E0D5"/>
@@ -3517,13 +3803,13 @@
                 <w:color w:val="1C1917"/>
                 <w:sz w:val="20"/>
               </w:rPr>
-              <w:t>Excel Form 3</w:t>
+              <w:t>Nama organisasi di paper</w:t>
             </w:r>
           </w:p>
         </w:tc>
         <w:tc>
           <w:tcPr>
-            <w:tcW w:type="dxa" w:w="3249"/>
+            <w:tcW w:type="dxa" w:w="4873"/>
             <w:tcBorders>
               <w:top w:val="single" w:sz="4" w:color="E8E0D5"/>
               <w:left w:val="single" w:sz="4" w:color="E8E0D5"/>
@@ -3544,120 +3830,7 @@
                 <w:color w:val="1C1917"/>
                 <w:sz w:val="20"/>
               </w:rPr>
-              <w:t>Forms → Open in Excel</w:t>
-            </w:r>
-          </w:p>
-        </w:tc>
-        <w:tc>
-          <w:tcPr>
-            <w:tcW w:type="dxa" w:w="3249"/>
-            <w:tcBorders>
-              <w:top w:val="single" w:sz="4" w:color="E8E0D5"/>
-              <w:left w:val="single" w:sz="4" w:color="E8E0D5"/>
-              <w:bottom w:val="single" w:sz="4" w:color="E8E0D5"/>
-              <w:right w:val="single" w:sz="4" w:color="E8E0D5"/>
-            </w:tcBorders>
-          </w:tcPr>
-          <w:p>
-            <w:pPr>
-              <w:spacing w:after="40" w:before="40"/>
-            </w:pPr>
-            <w:r/>
-            <w:r>
-              <w:rPr>
-                <w:rFonts w:ascii="Calibri" w:hAnsi="Calibri" w:eastAsia="Calibri"/>
-                <w:b w:val="0"/>
-                <w:i w:val="0"/>
-                <w:color w:val="1C1917"/>
-                <w:sz w:val="20"/>
-              </w:rPr>
-              <w:t>Satu baris per laptop</w:t>
-            </w:r>
-          </w:p>
-        </w:tc>
-      </w:tr>
-      <w:tr>
-        <w:tc>
-          <w:tcPr>
-            <w:tcW w:type="dxa" w:w="3249"/>
-            <w:tcBorders>
-              <w:top w:val="single" w:sz="4" w:color="E8E0D5"/>
-              <w:left w:val="single" w:sz="4" w:color="E8E0D5"/>
-              <w:bottom w:val="single" w:sz="4" w:color="E8E0D5"/>
-              <w:right w:val="single" w:sz="4" w:color="E8E0D5"/>
-            </w:tcBorders>
-            <w:shd w:fill="F7F3EE" w:val="clear"/>
-          </w:tcPr>
-          <w:p>
-            <w:pPr>
-              <w:spacing w:after="40" w:before="40"/>
-            </w:pPr>
-            <w:r/>
-            <w:r>
-              <w:rPr>
-                <w:rFonts w:ascii="Calibri" w:hAnsi="Calibri" w:eastAsia="Calibri"/>
-                <w:b w:val="0"/>
-                <w:i w:val="0"/>
-                <w:color w:val="1C1917"/>
-                <w:sz w:val="20"/>
-              </w:rPr>
-              <w:t>JSON simulator</w:t>
-            </w:r>
-          </w:p>
-        </w:tc>
-        <w:tc>
-          <w:tcPr>
-            <w:tcW w:type="dxa" w:w="3249"/>
-            <w:tcBorders>
-              <w:top w:val="single" w:sz="4" w:color="E8E0D5"/>
-              <w:left w:val="single" w:sz="4" w:color="E8E0D5"/>
-              <w:bottom w:val="single" w:sz="4" w:color="E8E0D5"/>
-              <w:right w:val="single" w:sz="4" w:color="E8E0D5"/>
-            </w:tcBorders>
-            <w:shd w:fill="F7F3EE" w:val="clear"/>
-          </w:tcPr>
-          <w:p>
-            <w:pPr>
-              <w:spacing w:after="40" w:before="40"/>
-            </w:pPr>
-            <w:r/>
-            <w:r>
-              <w:rPr>
-                <w:rFonts w:ascii="Calibri" w:hAnsi="Calibri" w:eastAsia="Calibri"/>
-                <w:b w:val="0"/>
-                <w:i w:val="0"/>
-                <w:color w:val="1C1917"/>
-                <w:sz w:val="20"/>
-              </w:rPr>
-              <w:t>Tombol Unduh sesi, dikirim fasilitator</w:t>
-            </w:r>
-          </w:p>
-        </w:tc>
-        <w:tc>
-          <w:tcPr>
-            <w:tcW w:type="dxa" w:w="3249"/>
-            <w:tcBorders>
-              <w:top w:val="single" w:sz="4" w:color="E8E0D5"/>
-              <w:left w:val="single" w:sz="4" w:color="E8E0D5"/>
-              <w:bottom w:val="single" w:sz="4" w:color="E8E0D5"/>
-              <w:right w:val="single" w:sz="4" w:color="E8E0D5"/>
-            </w:tcBorders>
-            <w:shd w:fill="F7F3EE" w:val="clear"/>
-          </w:tcPr>
-          <w:p>
-            <w:pPr>
-              <w:spacing w:after="40" w:before="40"/>
-            </w:pPr>
-            <w:r/>
-            <w:r>
-              <w:rPr>
-                <w:rFonts w:ascii="Calibri" w:hAnsi="Calibri" w:eastAsia="Calibri"/>
-                <w:b w:val="0"/>
-                <w:i w:val="0"/>
-                <w:color w:val="1C1917"/>
-                <w:sz w:val="20"/>
-              </w:rPr>
-              <w:t>{sesi}-G{n}.json ke abduh@itb.ac.id</w:t>
+              <w:t>Ketua peneliti menyamarkan (Organisasi A, B, …)</w:t>
             </w:r>
           </w:p>
         </w:tc>
@@ -3680,7 +3853,7 @@
           <w:color w:val="1C1917"/>
           <w:sz w:val="22"/>
         </w:rPr>
-        <w:t>Kirim ke peneliti (abduh@itb.ac.id): tiga Excel (jika fasilitator yang punya Form) + file JSON. Jangan kirim daftar hadir bernama. Olah sesuai instrumen v1.4 (cara pandang LPS pra–pasca pada 4 butir wajib, perilaku di SiapKerja, persepsi alat). Paper menulis organisasi sebagai Organisasi A, B, … plus jenis (kontraktor / konsultan / kampus / …).</w:t>
+        <w:t>Jangan kirim daftar hadir bernama. Paper menulis organisasi sebagai Organisasi A, B, … plus jenis (kontraktor / konsultan / kampus / …).</w:t>
       </w:r>
     </w:p>
     <w:p>
@@ -3696,7 +3869,7 @@
           <w:color w:val="9A4519"/>
           <w:sz w:val="28"/>
         </w:rPr>
-        <w:t>12. Jika sesuatu gagal</w:t>
+        <w:t>14. Jika sesuatu gagal</w:t>
       </w:r>
     </w:p>
     <w:tbl>
@@ -3821,7 +3994,7 @@
                 <w:color w:val="1C1917"/>
                 <w:sz w:val="20"/>
               </w:rPr>
-              <w:t>Banyak kelompok tidak sampai huddle</w:t>
+              <w:t>Banyak laptop tidak sampai huddle</w:t>
             </w:r>
           </w:p>
         </w:tc>
@@ -3875,7 +4048,7 @@
                 <w:color w:val="1C1917"/>
                 <w:sz w:val="20"/>
               </w:rPr>
-              <w:t>Catat tab terakhir; tetap isi Form 2</w:t>
+              <w:t>Catat tab terakhir di Form 3; tetap minta Form 2</w:t>
             </w:r>
           </w:p>
         </w:tc>
@@ -4044,7 +4217,7 @@
                 <w:color w:val="1C1917"/>
                 <w:sz w:val="20"/>
               </w:rPr>
-              <w:t>Lanjut simulator (sudah di browser); Form 2 bisa kertas lalu input nanti</w:t>
+              <w:t>Lanjut simulator (sudah di browser); Form 2 bisa diisi nanti dari tautan yang sama</w:t>
             </w:r>
           </w:p>
         </w:tc>
@@ -4074,7 +4247,7 @@
                 <w:color w:val="1C1917"/>
                 <w:sz w:val="20"/>
               </w:rPr>
-              <w:t>Peserta mengisi Form 2 sebelum main</w:t>
+              <w:t>Responden mengisi Form 2 sebelum main</w:t>
             </w:r>
           </w:p>
         </w:tc>
@@ -4159,7 +4332,7 @@
                 <w:color w:val="1C1917"/>
                 <w:sz w:val="20"/>
               </w:rPr>
-              <w:t>Dua perusahaan memakai sesi yang sama</w:t>
+              <w:t>Tautan Form tidak terbuka</w:t>
             </w:r>
           </w:p>
         </w:tc>
@@ -4186,7 +4359,7 @@
                 <w:color w:val="1C1917"/>
                 <w:sz w:val="20"/>
               </w:rPr>
-              <w:t>R01 akan menumpuk di Excel</w:t>
+              <w:t>Form milik ketua peneliti</w:t>
             </w:r>
           </w:p>
         </w:tc>
@@ -4213,7 +4386,7 @@
                 <w:color w:val="1C1917"/>
                 <w:sz w:val="20"/>
               </w:rPr>
-              <w:t>Jangan gabung baris itu; tetapkan sesi baru sebelum Form 1</w:t>
+              <w:t>Hubungi abduh@itb.ac.id; jangan membuat Form pengganti</w:t>
             </w:r>
           </w:p>
         </w:tc>
@@ -4237,7 +4410,7 @@
           <w:color w:val="9A4519"/>
           <w:sz w:val="28"/>
         </w:rPr>
-        <w:t>13. Daftar tilik fasilitator (cetak halaman ini)</w:t>
+        <w:t>15. Daftar tilik fasilitator (cetak halaman ini)</w:t>
       </w:r>
     </w:p>
     <w:p>
@@ -4252,7 +4425,22 @@
           <w:color w:val="1C1917"/>
           <w:sz w:val="22"/>
         </w:rPr>
-        <w:t>☐  Tiga tautan Form sudah diuji dan ditulis di tabel Bagian 2</w:t>
+        <w:t>☐  Kode sesi sudah diterima dari ketua peneliti</w:t>
+      </w:r>
+    </w:p>
+    <w:p>
+      <w:pPr>
+        <w:spacing w:after="80"/>
+      </w:pPr>
+      <w:r>
+        <w:rPr>
+          <w:rFonts w:ascii="Calibri" w:hAnsi="Calibri" w:eastAsia="Calibri"/>
+          <w:b w:val="0"/>
+          <w:i w:val="0"/>
+          <w:color w:val="1C1917"/>
+          <w:sz w:val="22"/>
+        </w:rPr>
+        <w:t>☐  Tiga tautan Form dari ketua peneliti sudah diuji (bukan Form buatan sendiri)</w:t>
       </w:r>
     </w:p>
     <w:p>
@@ -4282,7 +4470,7 @@
           <w:color w:val="1C1917"/>
           <w:sz w:val="22"/>
         </w:rPr>
-        <w:t>☐  Kode sesi ditetapkan; kartu R unik dalam sesi; kartu G per laptop</w:t>
+        <w:t>☐  Kartu R unik dalam sesi; kartu G per laptop</w:t>
       </w:r>
     </w:p>
     <w:p>
@@ -4297,7 +4485,7 @@
           <w:color w:val="1C1917"/>
           <w:sz w:val="22"/>
         </w:rPr>
-        <w:t>☐  1 laptop per kelompok; SiapKerja! sudah dibuka sekali (cache)</w:t>
+        <w:t>☐  Laptop: SiapKerja! sudah dibuka sekali (cache)</w:t>
       </w:r>
     </w:p>
     <w:p>
@@ -4342,7 +4530,7 @@
           <w:color w:val="1C1917"/>
           <w:sz w:val="22"/>
         </w:rPr>
-        <w:t>☐  Tidak meranking kelompok</w:t>
+        <w:t>☐  Tidak meranking; tidak membuat Form sendiri</w:t>
       </w:r>
     </w:p>
     <w:p>
@@ -4357,7 +4545,7 @@
           <w:color w:val="1C1917"/>
           <w:sz w:val="22"/>
         </w:rPr>
-        <w:t>☐  JSON diunduh fasilitator per laptop, nama {sesi}-G{n}.json, dikirim ke abduh@itb.ac.id</w:t>
+        <w:t>☐  JSON diunduh per laptop, nama {sesi}-G{n}.json, dikirim ke abduh@itb.ac.id</w:t>
       </w:r>
     </w:p>
     <w:p>
@@ -4402,7 +4590,7 @@
           <w:color w:val="1C1917"/>
           <w:sz w:val="22"/>
         </w:rPr>
-        <w:t>☐  Excel + JSON dikirim; daftar hadir bernama tidak dikirim</w:t>
+        <w:t>☐  Excel tidak dikirim (sudah di ketua peneliti); daftar hadir bernama tidak dikirim</w:t>
       </w:r>
     </w:p>
     <w:p>
@@ -4432,9 +4620,9 @@
           <w:color w:val="57534E"/>
           <w:sz w:val="18"/>
         </w:rPr>
-        <w:t>SiapKerja! 1.19.1  ·  Pedoman uji coba v1.4  ·  25 Agustus 2026</w:t>
+        <w:t>SiapKerja! 1.19.1  ·  Pedoman uji coba v1.5  ·  25 Agustus 2026</w:t>
         <w:br/>
-        <w:t>Berkas terkait: SiapKerja_Draft_Kuesioner.docx  ·  MSForms_01_Pra  ·  02_Pasca  ·  03_Pengamat</w:t>
+        <w:t>Ketua peneliti: abduh@itb.ac.id</w:t>
       </w:r>
     </w:p>
     <w:sectPr>
@@ -4463,7 +4651,7 @@
         <w:color w:val="57534E"/>
         <w:sz w:val="16"/>
       </w:rPr>
-      <w:t>SiapKerja! 1.19.1  ·  Pedoman uji coba v1.4  ·  evaluasi SiapKerja</w:t>
+      <w:t>SiapKerja! 1.19.1  ·  Pedoman uji coba v1.5  ·  untuk fasilitator</w:t>
     </w:r>
   </w:p>
 </w:ftr>

</xml_diff>

<commit_message>
feat: tautan Form 1 pra-simulasi
Tombol Buka Form di halaman Uji coba dan tabel Bagian 3 pedoman.
Form 2 dan Form 3 masih menunggu tautan dari ketua peneliti.
</commit_message>
<xml_diff>
--- a/SiapKerja_Pedoman_UjiCoba.docx
+++ b/SiapKerja_Pedoman_UjiCoba.docx
@@ -515,7 +515,7 @@
           <w:color w:val="1C1917"/>
           <w:sz w:val="22"/>
         </w:rPr>
-        <w:t>Ada satu Form 1, satu Form 2, dan satu Form 3 untuk semua perusahaan. Data masuk langsung ke akun Microsoft ketua peneliti. Jangan membuat Form baru. Jangan menyalin Form. Jangan merancang soal sendiri. Bagikan tautan yang dikirim ketua peneliti. Tempel tautan di tabel ini sebelum sesi.</w:t>
+        <w:t>Ada satu Form 1, satu Form 2, dan satu Form 3 untuk semua perusahaan. Data masuk langsung ke akun Microsoft ketua peneliti. Jangan membuat Form baru. Jangan menyalin Form. Jangan merancang soal sendiri. Bagikan tautan di tabel ini. Form 1 sudah terisi; Form 2 dan Form 3 menyusul dari ketua peneliti.</w:t>
       </w:r>
     </w:p>
     <w:tbl>
@@ -750,7 +750,7 @@
                 <w:color w:val="1C1917"/>
                 <w:sz w:val="20"/>
               </w:rPr>
-              <w:t>________________</w:t>
+              <w:t>https://forms.cloud.microsoft/Pages/ResponsePage.aspx?id=gxFu22VMXECCznzVP6bp3GNItEHSPX5Os8c_U2BUyEtUOFUwT0VHRklKRFI3RUdEWEg3S1ZZNzgyVS4u</w:t>
             </w:r>
           </w:p>
         </w:tc>

</xml_diff>

<commit_message>
feat: tautan Form 2 pasca-simulasi
Tombol Buka Form untuk Form 2. Form 3 pengamat masih menunggu tautan.
</commit_message>
<xml_diff>
--- a/SiapKerja_Pedoman_UjiCoba.docx
+++ b/SiapKerja_Pedoman_UjiCoba.docx
@@ -515,7 +515,7 @@
           <w:color w:val="1C1917"/>
           <w:sz w:val="22"/>
         </w:rPr>
-        <w:t>Ada satu Form 1, satu Form 2, dan satu Form 3 untuk semua perusahaan. Data masuk langsung ke akun Microsoft ketua peneliti. Jangan membuat Form baru. Jangan menyalin Form. Jangan merancang soal sendiri. Bagikan tautan di tabel ini. Form 1 sudah terisi; Form 2 dan Form 3 menyusul dari ketua peneliti.</w:t>
+        <w:t>Ada satu Form 1, satu Form 2, dan satu Form 3 untuk semua perusahaan. Data masuk langsung ke akun Microsoft ketua peneliti. Jangan membuat Form baru. Jangan menyalin Form. Jangan merancang soal sendiri. Bagikan tautan di tabel ini. Form 1 dan Form 2 sudah terisi; Form 3 (pengamat) menyusul dari ketua peneliti.</w:t>
       </w:r>
     </w:p>
     <w:tbl>
@@ -864,7 +864,7 @@
                 <w:color w:val="1C1917"/>
                 <w:sz w:val="20"/>
               </w:rPr>
-              <w:t>________________</w:t>
+              <w:t>https://forms.cloud.microsoft/Pages/ResponsePage.aspx?id=gxFu22VMXECCznzVP6bp3GNItEHSPX5Os8c_U2BUyEtURVVXQzNZSFNEQUJHWEVPM1VZM0NYUTQ1Ri4u</w:t>
             </w:r>
           </w:p>
         </w:tc>

</xml_diff>

<commit_message>
feat: tautan Form 3 pengamat
Ketiga Microsoft Form lengkap di halaman Uji coba dan pedoman.
</commit_message>
<xml_diff>
--- a/SiapKerja_Pedoman_UjiCoba.docx
+++ b/SiapKerja_Pedoman_UjiCoba.docx
@@ -515,7 +515,7 @@
           <w:color w:val="1C1917"/>
           <w:sz w:val="22"/>
         </w:rPr>
-        <w:t>Ada satu Form 1, satu Form 2, dan satu Form 3 untuk semua perusahaan. Data masuk langsung ke akun Microsoft ketua peneliti. Jangan membuat Form baru. Jangan menyalin Form. Jangan merancang soal sendiri. Bagikan tautan di tabel ini. Form 1 dan Form 2 sudah terisi; Form 3 (pengamat) menyusul dari ketua peneliti.</w:t>
+        <w:t>Ada satu Form 1, satu Form 2, dan satu Form 3 untuk semua perusahaan. Data masuk langsung ke akun Microsoft ketua peneliti. Jangan membuat Form baru. Jangan menyalin Form. Jangan merancang soal sendiri. Bagikan tautan di tabel ini. Ketiga Form sudah terisi — jangan membuat Form pengganti.</w:t>
       </w:r>
     </w:p>
     <w:tbl>
@@ -974,7 +974,7 @@
                 <w:color w:val="1C1917"/>
                 <w:sz w:val="20"/>
               </w:rPr>
-              <w:t>________________</w:t>
+              <w:t>https://forms.cloud.microsoft/Pages/ResponsePage.aspx?id=gxFu22VMXECCznzVP6bp3GNItEHSPX5Os8c_U2BUyEtUNjEyTkhOSkY0VjIyNks4M1Y1S0ZKQUdNVC4u</w:t>
             </w:r>
           </w:p>
         </w:tc>

</xml_diff>

<commit_message>
docs: arahan penomoran sesi, G, dan R untuk fasilitator
Resep kode S+tanggal+huruf dari ketua; cara fasilitator
membagi G/R di papan; contoh 5 orang 2 laptop.
</commit_message>
<xml_diff>
--- a/SiapKerja_Pedoman_UjiCoba.docx
+++ b/SiapKerja_Pedoman_UjiCoba.docx
@@ -1028,7 +1028,7 @@
           <w:color w:val="1C1917"/>
           <w:sz w:val="22"/>
         </w:rPr>
-        <w:t>Ketua peneliti memberi Anda kode sesi sebelum hari-H. Pakai kode itu. Jangan membuat kode sesi sendiri. Anda yang membagikan R dan G kepada responden di sesi Anda.</w:t>
+        <w:t>Ada tiga kode. Kode sesi datang dari ketua peneliti. Kode G dan R Anda yang membuat di hari-H. Responden tidak boleh mengarang kode.</w:t>
       </w:r>
     </w:p>
     <w:tbl>
@@ -1153,7 +1153,7 @@
                 <w:color w:val="FFFFFF"/>
                 <w:sz w:val="20"/>
               </w:rPr>
-              <w:t>Siapa yang memberi</w:t>
+              <w:t>Siapa yang membuat</w:t>
             </w:r>
           </w:p>
         </w:tc>
@@ -1209,7 +1209,7 @@
                 <w:color w:val="1C1917"/>
                 <w:sz w:val="20"/>
               </w:rPr>
-              <w:t>Satu perusahaan / satu hari uji coba</w:t>
+              <w:t>Satu perusahaan, satu duduk uji coba</w:t>
             </w:r>
           </w:p>
         </w:tc>
@@ -1263,7 +1263,7 @@
                 <w:color w:val="1C1917"/>
                 <w:sz w:val="20"/>
               </w:rPr>
-              <w:t>Ketua peneliti, ke fasilitator</w:t>
+              <w:t>Ketua peneliti, dikirim ke fasilitator sebelum hari-H</w:t>
             </w:r>
           </w:p>
         </w:tc>
@@ -1377,7 +1377,7 @@
                 <w:color w:val="1C1917"/>
                 <w:sz w:val="20"/>
               </w:rPr>
-              <w:t>Fasilitator</w:t>
+              <w:t>Fasilitator, di papan / kartu</w:t>
             </w:r>
           </w:p>
         </w:tc>
@@ -1487,7 +1487,7 @@
                 <w:color w:val="1C1917"/>
                 <w:sz w:val="20"/>
               </w:rPr>
-              <w:t>Fasilitator</w:t>
+              <w:t>Fasilitator, di papan / kartu</w:t>
             </w:r>
           </w:p>
         </w:tc>
@@ -1614,6 +1614,340 @@
     </w:p>
     <w:p>
       <w:pPr>
+        <w:pStyle w:val="Heading2"/>
+        <w:spacing w:before="200" w:after="120"/>
+      </w:pPr>
+      <w:r>
+        <w:rPr>
+          <w:rFonts w:ascii="Calibri" w:hAnsi="Calibri" w:eastAsia="Calibri"/>
+          <w:b/>
+          <w:i w:val="0"/>
+          <w:color w:val="9A4519"/>
+          <w:sz w:val="24"/>
+        </w:rPr>
+        <w:t>Cara ketua menomori sesi</w:t>
+      </w:r>
+    </w:p>
+    <w:p>
+      <w:pPr>
+        <w:spacing w:after="160" w:before="0" w:line="276" w:lineRule="auto"/>
+      </w:pPr>
+      <w:r>
+        <w:rPr>
+          <w:rFonts w:ascii="Calibri" w:hAnsi="Calibri" w:eastAsia="Calibri"/>
+          <w:b w:val="0"/>
+          <w:i w:val="0"/>
+          <w:color w:val="1C1917"/>
+          <w:sz w:val="22"/>
+        </w:rPr>
+        <w:t>Pola: S + tahun 2 digit + bulan + tanggal + tanda hubung + huruf. Huruf A untuk duduk pertama hari itu, B untuk duduk kedua (perusahaan lain, atau sesi sore di perusahaan yang sama). Satu duduk = satu kode, berapa pun jumlah laptop.</w:t>
+      </w:r>
+    </w:p>
+    <w:tbl>
+      <w:tblPr>
+        <w:tblW w:type="auto" w:w="0"/>
+        <w:jc w:val="center"/>
+        <w:tblLayout w:type="autofit"/>
+        <w:tblLook w:firstColumn="1" w:firstRow="1" w:lastColumn="0" w:lastRow="0" w:noHBand="0" w:noVBand="1" w:val="04A0"/>
+      </w:tblPr>
+      <w:tblGrid>
+        <w:gridCol w:w="4873"/>
+        <w:gridCol w:w="4873"/>
+      </w:tblGrid>
+      <w:tr>
+        <w:tc>
+          <w:tcPr>
+            <w:tcW w:type="dxa" w:w="4873"/>
+            <w:shd w:fill="C45C26" w:val="clear"/>
+            <w:tcBorders>
+              <w:top w:val="single" w:sz="4" w:color="E8E0D5"/>
+              <w:left w:val="single" w:sz="4" w:color="E8E0D5"/>
+              <w:bottom w:val="single" w:sz="4" w:color="E8E0D5"/>
+              <w:right w:val="single" w:sz="4" w:color="E8E0D5"/>
+            </w:tcBorders>
+          </w:tcPr>
+          <w:p>
+            <w:pPr>
+              <w:spacing w:after="40" w:before="40"/>
+            </w:pPr>
+            <w:r/>
+            <w:r>
+              <w:rPr>
+                <w:rFonts w:ascii="Calibri" w:hAnsi="Calibri" w:eastAsia="Calibri"/>
+                <w:b/>
+                <w:i w:val="0"/>
+                <w:color w:val="FFFFFF"/>
+                <w:sz w:val="20"/>
+              </w:rPr>
+              <w:t>Situasi</w:t>
+            </w:r>
+          </w:p>
+        </w:tc>
+        <w:tc>
+          <w:tcPr>
+            <w:tcW w:type="dxa" w:w="4873"/>
+            <w:shd w:fill="C45C26" w:val="clear"/>
+            <w:tcBorders>
+              <w:top w:val="single" w:sz="4" w:color="E8E0D5"/>
+              <w:left w:val="single" w:sz="4" w:color="E8E0D5"/>
+              <w:bottom w:val="single" w:sz="4" w:color="E8E0D5"/>
+              <w:right w:val="single" w:sz="4" w:color="E8E0D5"/>
+            </w:tcBorders>
+          </w:tcPr>
+          <w:p>
+            <w:pPr>
+              <w:spacing w:after="40" w:before="40"/>
+            </w:pPr>
+            <w:r/>
+            <w:r>
+              <w:rPr>
+                <w:rFonts w:ascii="Calibri" w:hAnsi="Calibri" w:eastAsia="Calibri"/>
+                <w:b/>
+                <w:i w:val="0"/>
+                <w:color w:val="FFFFFF"/>
+                <w:sz w:val="20"/>
+              </w:rPr>
+              <w:t>Kode sesi</w:t>
+            </w:r>
+          </w:p>
+        </w:tc>
+      </w:tr>
+      <w:tr>
+        <w:tc>
+          <w:tcPr>
+            <w:tcW w:type="dxa" w:w="4873"/>
+            <w:tcBorders>
+              <w:top w:val="single" w:sz="4" w:color="E8E0D5"/>
+              <w:left w:val="single" w:sz="4" w:color="E8E0D5"/>
+              <w:bottom w:val="single" w:sz="4" w:color="E8E0D5"/>
+              <w:right w:val="single" w:sz="4" w:color="E8E0D5"/>
+            </w:tcBorders>
+          </w:tcPr>
+          <w:p>
+            <w:pPr>
+              <w:spacing w:after="40" w:before="40"/>
+            </w:pPr>
+            <w:r/>
+            <w:r>
+              <w:rPr>
+                <w:rFonts w:ascii="Calibri" w:hAnsi="Calibri" w:eastAsia="Calibri"/>
+                <w:b w:val="0"/>
+                <w:i w:val="0"/>
+                <w:color w:val="1C1917"/>
+                <w:sz w:val="20"/>
+              </w:rPr>
+              <w:t>Perusahaan Pagi, 1 September 2026, satu duduk</w:t>
+            </w:r>
+          </w:p>
+        </w:tc>
+        <w:tc>
+          <w:tcPr>
+            <w:tcW w:type="dxa" w:w="4873"/>
+            <w:tcBorders>
+              <w:top w:val="single" w:sz="4" w:color="E8E0D5"/>
+              <w:left w:val="single" w:sz="4" w:color="E8E0D5"/>
+              <w:bottom w:val="single" w:sz="4" w:color="E8E0D5"/>
+              <w:right w:val="single" w:sz="4" w:color="E8E0D5"/>
+            </w:tcBorders>
+          </w:tcPr>
+          <w:p>
+            <w:pPr>
+              <w:spacing w:after="40" w:before="40"/>
+            </w:pPr>
+            <w:r/>
+            <w:r>
+              <w:rPr>
+                <w:rFonts w:ascii="Calibri" w:hAnsi="Calibri" w:eastAsia="Calibri"/>
+                <w:b w:val="0"/>
+                <w:i w:val="0"/>
+                <w:color w:val="1C1917"/>
+                <w:sz w:val="20"/>
+              </w:rPr>
+              <w:t>S260901-A</w:t>
+            </w:r>
+          </w:p>
+        </w:tc>
+      </w:tr>
+      <w:tr>
+        <w:tc>
+          <w:tcPr>
+            <w:tcW w:type="dxa" w:w="4873"/>
+            <w:tcBorders>
+              <w:top w:val="single" w:sz="4" w:color="E8E0D5"/>
+              <w:left w:val="single" w:sz="4" w:color="E8E0D5"/>
+              <w:bottom w:val="single" w:sz="4" w:color="E8E0D5"/>
+              <w:right w:val="single" w:sz="4" w:color="E8E0D5"/>
+            </w:tcBorders>
+            <w:shd w:fill="F7F3EE" w:val="clear"/>
+          </w:tcPr>
+          <w:p>
+            <w:pPr>
+              <w:spacing w:after="40" w:before="40"/>
+            </w:pPr>
+            <w:r/>
+            <w:r>
+              <w:rPr>
+                <w:rFonts w:ascii="Calibri" w:hAnsi="Calibri" w:eastAsia="Calibri"/>
+                <w:b w:val="0"/>
+                <w:i w:val="0"/>
+                <w:color w:val="1C1917"/>
+                <w:sz w:val="20"/>
+              </w:rPr>
+              <w:t>Perusahaan lain, hari yang sama</w:t>
+            </w:r>
+          </w:p>
+        </w:tc>
+        <w:tc>
+          <w:tcPr>
+            <w:tcW w:type="dxa" w:w="4873"/>
+            <w:tcBorders>
+              <w:top w:val="single" w:sz="4" w:color="E8E0D5"/>
+              <w:left w:val="single" w:sz="4" w:color="E8E0D5"/>
+              <w:bottom w:val="single" w:sz="4" w:color="E8E0D5"/>
+              <w:right w:val="single" w:sz="4" w:color="E8E0D5"/>
+            </w:tcBorders>
+            <w:shd w:fill="F7F3EE" w:val="clear"/>
+          </w:tcPr>
+          <w:p>
+            <w:pPr>
+              <w:spacing w:after="40" w:before="40"/>
+            </w:pPr>
+            <w:r/>
+            <w:r>
+              <w:rPr>
+                <w:rFonts w:ascii="Calibri" w:hAnsi="Calibri" w:eastAsia="Calibri"/>
+                <w:b w:val="0"/>
+                <w:i w:val="0"/>
+                <w:color w:val="1C1917"/>
+                <w:sz w:val="20"/>
+              </w:rPr>
+              <w:t>S260901-B</w:t>
+            </w:r>
+          </w:p>
+        </w:tc>
+      </w:tr>
+      <w:tr>
+        <w:tc>
+          <w:tcPr>
+            <w:tcW w:type="dxa" w:w="4873"/>
+            <w:tcBorders>
+              <w:top w:val="single" w:sz="4" w:color="E8E0D5"/>
+              <w:left w:val="single" w:sz="4" w:color="E8E0D5"/>
+              <w:bottom w:val="single" w:sz="4" w:color="E8E0D5"/>
+              <w:right w:val="single" w:sz="4" w:color="E8E0D5"/>
+            </w:tcBorders>
+          </w:tcPr>
+          <w:p>
+            <w:pPr>
+              <w:spacing w:after="40" w:before="40"/>
+            </w:pPr>
+            <w:r/>
+            <w:r>
+              <w:rPr>
+                <w:rFonts w:ascii="Calibri" w:hAnsi="Calibri" w:eastAsia="Calibri"/>
+                <w:b w:val="0"/>
+                <w:i w:val="0"/>
+                <w:color w:val="1C1917"/>
+                <w:sz w:val="20"/>
+              </w:rPr>
+              <w:t>Perusahaan Pagi lagi, sesi sore hari itu</w:t>
+            </w:r>
+          </w:p>
+        </w:tc>
+        <w:tc>
+          <w:tcPr>
+            <w:tcW w:type="dxa" w:w="4873"/>
+            <w:tcBorders>
+              <w:top w:val="single" w:sz="4" w:color="E8E0D5"/>
+              <w:left w:val="single" w:sz="4" w:color="E8E0D5"/>
+              <w:bottom w:val="single" w:sz="4" w:color="E8E0D5"/>
+              <w:right w:val="single" w:sz="4" w:color="E8E0D5"/>
+            </w:tcBorders>
+          </w:tcPr>
+          <w:p>
+            <w:pPr>
+              <w:spacing w:after="40" w:before="40"/>
+            </w:pPr>
+            <w:r/>
+            <w:r>
+              <w:rPr>
+                <w:rFonts w:ascii="Calibri" w:hAnsi="Calibri" w:eastAsia="Calibri"/>
+                <w:b w:val="0"/>
+                <w:i w:val="0"/>
+                <w:color w:val="1C1917"/>
+                <w:sz w:val="20"/>
+              </w:rPr>
+              <w:t>S260901-C</w:t>
+            </w:r>
+          </w:p>
+        </w:tc>
+      </w:tr>
+      <w:tr>
+        <w:tc>
+          <w:tcPr>
+            <w:tcW w:type="dxa" w:w="4873"/>
+            <w:tcBorders>
+              <w:top w:val="single" w:sz="4" w:color="E8E0D5"/>
+              <w:left w:val="single" w:sz="4" w:color="E8E0D5"/>
+              <w:bottom w:val="single" w:sz="4" w:color="E8E0D5"/>
+              <w:right w:val="single" w:sz="4" w:color="E8E0D5"/>
+            </w:tcBorders>
+            <w:shd w:fill="F7F3EE" w:val="clear"/>
+          </w:tcPr>
+          <w:p>
+            <w:pPr>
+              <w:spacing w:after="40" w:before="40"/>
+            </w:pPr>
+            <w:r/>
+            <w:r>
+              <w:rPr>
+                <w:rFonts w:ascii="Calibri" w:hAnsi="Calibri" w:eastAsia="Calibri"/>
+                <w:b w:val="0"/>
+                <w:i w:val="0"/>
+                <w:color w:val="1C1917"/>
+                <w:sz w:val="20"/>
+              </w:rPr>
+              <w:t>Perusahaan Pagi, hari berikutnya</w:t>
+            </w:r>
+          </w:p>
+        </w:tc>
+        <w:tc>
+          <w:tcPr>
+            <w:tcW w:type="dxa" w:w="4873"/>
+            <w:tcBorders>
+              <w:top w:val="single" w:sz="4" w:color="E8E0D5"/>
+              <w:left w:val="single" w:sz="4" w:color="E8E0D5"/>
+              <w:bottom w:val="single" w:sz="4" w:color="E8E0D5"/>
+              <w:right w:val="single" w:sz="4" w:color="E8E0D5"/>
+            </w:tcBorders>
+            <w:shd w:fill="F7F3EE" w:val="clear"/>
+          </w:tcPr>
+          <w:p>
+            <w:pPr>
+              <w:spacing w:after="40" w:before="40"/>
+            </w:pPr>
+            <w:r/>
+            <w:r>
+              <w:rPr>
+                <w:rFonts w:ascii="Calibri" w:hAnsi="Calibri" w:eastAsia="Calibri"/>
+                <w:b w:val="0"/>
+                <w:i w:val="0"/>
+                <w:color w:val="1C1917"/>
+                <w:sz w:val="20"/>
+              </w:rPr>
+              <w:t>S260902-A</w:t>
+            </w:r>
+          </w:p>
+        </w:tc>
+      </w:tr>
+    </w:tbl>
+    <w:p>
+      <w:pPr>
+        <w:spacing w:after="160"/>
+      </w:pPr>
+    </w:p>
+    <w:p>
+      <w:pPr>
         <w:spacing w:after="200" w:before="0" w:line="276" w:lineRule="auto"/>
       </w:pPr>
       <w:r>
@@ -1624,7 +1958,691 @@
           <w:color w:val="1C1917"/>
           <w:sz w:val="22"/>
         </w:rPr>
-        <w:t>R jangan diulang per laptop. Dalam satu sesi, R01 hanya satu orang meski ada G1 dan G2. Nama orang tidak ditulis di mana pun. Nama organisasi diisi, disamarkan di paper. Gabung pra–pasca di Excel urusan ketua peneliti (kolom sesi + R).</w:t>
+        <w:t>Kirim ke fasilitator sehari sebelumnya, satu baris saja: “Kode sesi Anda S260901-A. Huruf jangan diubah.” Fasilitator tidak membuat kode sesi sendiri — kalau dua orang sama-sama memakai S260901-A, Excel menumpuk.</w:t>
+      </w:r>
+    </w:p>
+    <w:p>
+      <w:pPr>
+        <w:pStyle w:val="Heading2"/>
+        <w:spacing w:before="200" w:after="120"/>
+      </w:pPr>
+      <w:r>
+        <w:rPr>
+          <w:rFonts w:ascii="Calibri" w:hAnsi="Calibri" w:eastAsia="Calibri"/>
+          <w:b/>
+          <w:i w:val="0"/>
+          <w:color w:val="9A4519"/>
+          <w:sz w:val="24"/>
+        </w:rPr>
+        <w:t>Cara fasilitator menomori G dan R di hari-H</w:t>
+      </w:r>
+    </w:p>
+    <w:p>
+      <w:pPr>
+        <w:pStyle w:val="ListNumber"/>
+        <w:spacing w:after="60"/>
+      </w:pPr>
+      <w:r>
+        <w:rPr>
+          <w:rFonts w:ascii="Calibri" w:hAnsi="Calibri" w:eastAsia="Calibri"/>
+          <w:b w:val="0"/>
+          <w:i w:val="0"/>
+          <w:color w:val="1C1917"/>
+          <w:sz w:val="22"/>
+        </w:rPr>
+        <w:t>Tulis di papan besar, sebelum Form 1 dibuka: SESI = (kode dari ketua).</w:t>
+      </w:r>
+    </w:p>
+    <w:p>
+      <w:pPr>
+        <w:pStyle w:val="ListNumber"/>
+        <w:spacing w:after="60"/>
+      </w:pPr>
+      <w:r>
+        <w:rPr>
+          <w:rFonts w:ascii="Calibri" w:hAnsi="Calibri" w:eastAsia="Calibri"/>
+          <w:b w:val="0"/>
+          <w:i w:val="0"/>
+          <w:color w:val="1C1917"/>
+          <w:sz w:val="22"/>
+        </w:rPr>
+        <w:t>Tiap laptop satu G, urut dari 1. Laptop kiri G1, berikutnya G2. Jangan loncat. Jangan pakai nama ruangan atau inisial orang.</w:t>
+      </w:r>
+    </w:p>
+    <w:p>
+      <w:pPr>
+        <w:pStyle w:val="ListNumber"/>
+        <w:spacing w:after="60"/>
+      </w:pPr>
+      <w:r>
+        <w:rPr>
+          <w:rFonts w:ascii="Calibri" w:hAnsi="Calibri" w:eastAsia="Calibri"/>
+          <w:b w:val="0"/>
+          <w:i w:val="0"/>
+          <w:color w:val="1C1917"/>
+          <w:sz w:val="22"/>
+        </w:rPr>
+        <w:t>Tiap orang satu R, urut dari 01 di seluruh ruangan — bukan diulang per laptop. G1 boleh R01–R03; G2 mulai R04, bukan R01 lagi.</w:t>
+      </w:r>
+    </w:p>
+    <w:p>
+      <w:pPr>
+        <w:pStyle w:val="ListNumber"/>
+        <w:spacing w:after="60"/>
+      </w:pPr>
+      <w:r>
+        <w:rPr>
+          <w:rFonts w:ascii="Calibri" w:hAnsi="Calibri" w:eastAsia="Calibri"/>
+          <w:b w:val="0"/>
+          <w:i w:val="0"/>
+          <w:color w:val="1C1917"/>
+          <w:sz w:val="22"/>
+        </w:rPr>
+        <w:t>Katakan ke tiap orang: “Di Form 1 dan Form 2 ketik persis tiga kode ini. Form 2 nanti kode yang sama.”</w:t>
+      </w:r>
+    </w:p>
+    <w:p>
+      <w:pPr>
+        <w:pStyle w:val="ListNumber"/>
+        <w:spacing w:after="60"/>
+      </w:pPr>
+      <w:r>
+        <w:rPr>
+          <w:rFonts w:ascii="Calibri" w:hAnsi="Calibri" w:eastAsia="Calibri"/>
+          <w:b w:val="0"/>
+          <w:i w:val="0"/>
+          <w:color w:val="1C1917"/>
+          <w:sz w:val="22"/>
+        </w:rPr>
+        <w:t>Anda mengisi Form 3 satu kali per laptop: kode sesi yang sama, G laptop itu. Bukan R.</w:t>
+      </w:r>
+    </w:p>
+    <w:p>
+      <w:pPr>
+        <w:pStyle w:val="ListNumber"/>
+        <w:spacing w:after="60"/>
+      </w:pPr>
+      <w:r>
+        <w:rPr>
+          <w:rFonts w:ascii="Calibri" w:hAnsi="Calibri" w:eastAsia="Calibri"/>
+          <w:b w:val="0"/>
+          <w:i w:val="0"/>
+          <w:color w:val="1C1917"/>
+          <w:sz w:val="22"/>
+        </w:rPr>
+        <w:t>Datang telat: beri R berikutnya yang belum terpakai. Jangan mendaur ulang R orang yang sudah pulang.</w:t>
+      </w:r>
+    </w:p>
+    <w:p>
+      <w:pPr>
+        <w:pStyle w:val="ListNumber"/>
+        <w:spacing w:after="60"/>
+      </w:pPr>
+      <w:r>
+        <w:rPr>
+          <w:rFonts w:ascii="Calibri" w:hAnsi="Calibri" w:eastAsia="Calibri"/>
+          <w:b w:val="0"/>
+          <w:i w:val="0"/>
+          <w:color w:val="1C1917"/>
+          <w:sz w:val="22"/>
+        </w:rPr>
+        <w:t>Sesi kedua hari itu (kode sesi berbeda dari ketua): R boleh mulai R01 lagi, karena sesinya sudah lain.</w:t>
+      </w:r>
+    </w:p>
+    <w:p>
+      <w:pPr>
+        <w:pStyle w:val="Heading2"/>
+        <w:spacing w:before="200" w:after="120"/>
+      </w:pPr>
+      <w:r>
+        <w:rPr>
+          <w:rFonts w:ascii="Calibri" w:hAnsi="Calibri" w:eastAsia="Calibri"/>
+          <w:b/>
+          <w:i w:val="0"/>
+          <w:color w:val="9A4519"/>
+          <w:sz w:val="24"/>
+        </w:rPr>
+        <w:t>Contoh satu ruangan — 5 orang, 2 laptop, kode sesi S260901-A</w:t>
+      </w:r>
+    </w:p>
+    <w:tbl>
+      <w:tblPr>
+        <w:tblW w:type="auto" w:w="0"/>
+        <w:jc w:val="center"/>
+        <w:tblLayout w:type="autofit"/>
+        <w:tblLook w:firstColumn="1" w:firstRow="1" w:lastColumn="0" w:lastRow="0" w:noHBand="0" w:noVBand="1" w:val="04A0"/>
+      </w:tblPr>
+      <w:tblGrid>
+        <w:gridCol w:w="1624"/>
+        <w:gridCol w:w="1624"/>
+        <w:gridCol w:w="1624"/>
+        <w:gridCol w:w="1624"/>
+        <w:gridCol w:w="1624"/>
+        <w:gridCol w:w="1624"/>
+      </w:tblGrid>
+      <w:tr>
+        <w:tc>
+          <w:tcPr>
+            <w:tcW w:type="dxa" w:w="1624"/>
+            <w:shd w:fill="C45C26" w:val="clear"/>
+            <w:tcBorders>
+              <w:top w:val="single" w:sz="4" w:color="E8E0D5"/>
+              <w:left w:val="single" w:sz="4" w:color="E8E0D5"/>
+              <w:bottom w:val="single" w:sz="4" w:color="E8E0D5"/>
+              <w:right w:val="single" w:sz="4" w:color="E8E0D5"/>
+            </w:tcBorders>
+          </w:tcPr>
+          <w:p>
+            <w:pPr>
+              <w:spacing w:after="40" w:before="40"/>
+            </w:pPr>
+            <w:r/>
+            <w:r>
+              <w:rPr>
+                <w:rFonts w:ascii="Calibri" w:hAnsi="Calibri" w:eastAsia="Calibri"/>
+                <w:b/>
+                <w:i w:val="0"/>
+                <w:color w:val="FFFFFF"/>
+                <w:sz w:val="20"/>
+              </w:rPr>
+              <w:t>Laptop</w:t>
+            </w:r>
+          </w:p>
+        </w:tc>
+        <w:tc>
+          <w:tcPr>
+            <w:tcW w:type="dxa" w:w="1624"/>
+            <w:shd w:fill="C45C26" w:val="clear"/>
+            <w:tcBorders>
+              <w:top w:val="single" w:sz="4" w:color="E8E0D5"/>
+              <w:left w:val="single" w:sz="4" w:color="E8E0D5"/>
+              <w:bottom w:val="single" w:sz="4" w:color="E8E0D5"/>
+              <w:right w:val="single" w:sz="4" w:color="E8E0D5"/>
+            </w:tcBorders>
+          </w:tcPr>
+          <w:p>
+            <w:pPr>
+              <w:spacing w:after="40" w:before="40"/>
+            </w:pPr>
+            <w:r/>
+            <w:r>
+              <w:rPr>
+                <w:rFonts w:ascii="Calibri" w:hAnsi="Calibri" w:eastAsia="Calibri"/>
+                <w:b/>
+                <w:i w:val="0"/>
+                <w:color w:val="FFFFFF"/>
+                <w:sz w:val="20"/>
+              </w:rPr>
+              <w:t>G</w:t>
+            </w:r>
+          </w:p>
+        </w:tc>
+        <w:tc>
+          <w:tcPr>
+            <w:tcW w:type="dxa" w:w="1624"/>
+            <w:shd w:fill="C45C26" w:val="clear"/>
+            <w:tcBorders>
+              <w:top w:val="single" w:sz="4" w:color="E8E0D5"/>
+              <w:left w:val="single" w:sz="4" w:color="E8E0D5"/>
+              <w:bottom w:val="single" w:sz="4" w:color="E8E0D5"/>
+              <w:right w:val="single" w:sz="4" w:color="E8E0D5"/>
+            </w:tcBorders>
+          </w:tcPr>
+          <w:p>
+            <w:pPr>
+              <w:spacing w:after="40" w:before="40"/>
+            </w:pPr>
+            <w:r/>
+            <w:r>
+              <w:rPr>
+                <w:rFonts w:ascii="Calibri" w:hAnsi="Calibri" w:eastAsia="Calibri"/>
+                <w:b/>
+                <w:i w:val="0"/>
+                <w:color w:val="FFFFFF"/>
+                <w:sz w:val="20"/>
+              </w:rPr>
+              <w:t>Orang di laptop itu</w:t>
+            </w:r>
+          </w:p>
+        </w:tc>
+        <w:tc>
+          <w:tcPr>
+            <w:tcW w:type="dxa" w:w="1624"/>
+            <w:shd w:fill="C45C26" w:val="clear"/>
+            <w:tcBorders>
+              <w:top w:val="single" w:sz="4" w:color="E8E0D5"/>
+              <w:left w:val="single" w:sz="4" w:color="E8E0D5"/>
+              <w:bottom w:val="single" w:sz="4" w:color="E8E0D5"/>
+              <w:right w:val="single" w:sz="4" w:color="E8E0D5"/>
+            </w:tcBorders>
+          </w:tcPr>
+          <w:p>
+            <w:pPr>
+              <w:spacing w:after="40" w:before="40"/>
+            </w:pPr>
+            <w:r/>
+            <w:r>
+              <w:rPr>
+                <w:rFonts w:ascii="Calibri" w:hAnsi="Calibri" w:eastAsia="Calibri"/>
+                <w:b/>
+                <w:i w:val="0"/>
+                <w:color w:val="FFFFFF"/>
+                <w:sz w:val="20"/>
+              </w:rPr>
+              <w:t>Yang diketik di Form 1 dan Form 2</w:t>
+            </w:r>
+          </w:p>
+        </w:tc>
+        <w:tc>
+          <w:tcPr>
+            <w:tcW w:type="dxa" w:w="1624"/>
+            <w:shd w:fill="C45C26" w:val="clear"/>
+            <w:tcBorders>
+              <w:top w:val="single" w:sz="4" w:color="E8E0D5"/>
+              <w:left w:val="single" w:sz="4" w:color="E8E0D5"/>
+              <w:bottom w:val="single" w:sz="4" w:color="E8E0D5"/>
+              <w:right w:val="single" w:sz="4" w:color="E8E0D5"/>
+            </w:tcBorders>
+          </w:tcPr>
+          <w:p>
+            <w:pPr>
+              <w:spacing w:after="40" w:before="40"/>
+            </w:pPr>
+            <w:r/>
+            <w:r>
+              <w:rPr>
+                <w:rFonts w:ascii="Calibri" w:hAnsi="Calibri" w:eastAsia="Calibri"/>
+                <w:b/>
+                <w:i w:val="0"/>
+                <w:color w:val="FFFFFF"/>
+                <w:sz w:val="20"/>
+              </w:rPr>
+              <w:t>Form 3 (Anda)</w:t>
+            </w:r>
+          </w:p>
+        </w:tc>
+        <w:tc>
+          <w:tcPr>
+            <w:tcW w:type="dxa" w:w="1624"/>
+            <w:shd w:fill="C45C26" w:val="clear"/>
+            <w:tcBorders>
+              <w:top w:val="single" w:sz="4" w:color="E8E0D5"/>
+              <w:left w:val="single" w:sz="4" w:color="E8E0D5"/>
+              <w:bottom w:val="single" w:sz="4" w:color="E8E0D5"/>
+              <w:right w:val="single" w:sz="4" w:color="E8E0D5"/>
+            </w:tcBorders>
+          </w:tcPr>
+          <w:p>
+            <w:pPr>
+              <w:spacing w:after="40" w:before="40"/>
+            </w:pPr>
+            <w:r/>
+            <w:r>
+              <w:rPr>
+                <w:rFonts w:ascii="Calibri" w:hAnsi="Calibri" w:eastAsia="Calibri"/>
+                <w:b/>
+                <w:i w:val="0"/>
+                <w:color w:val="FFFFFF"/>
+                <w:sz w:val="20"/>
+              </w:rPr>
+              <w:t>Nama file JSON</w:t>
+            </w:r>
+          </w:p>
+        </w:tc>
+      </w:tr>
+      <w:tr>
+        <w:tc>
+          <w:tcPr>
+            <w:tcW w:type="dxa" w:w="1624"/>
+            <w:tcBorders>
+              <w:top w:val="single" w:sz="4" w:color="E8E0D5"/>
+              <w:left w:val="single" w:sz="4" w:color="E8E0D5"/>
+              <w:bottom w:val="single" w:sz="4" w:color="E8E0D5"/>
+              <w:right w:val="single" w:sz="4" w:color="E8E0D5"/>
+            </w:tcBorders>
+          </w:tcPr>
+          <w:p>
+            <w:pPr>
+              <w:spacing w:after="40" w:before="40"/>
+            </w:pPr>
+            <w:r/>
+            <w:r>
+              <w:rPr>
+                <w:rFonts w:ascii="Calibri" w:hAnsi="Calibri" w:eastAsia="Calibri"/>
+                <w:b w:val="0"/>
+                <w:i w:val="0"/>
+                <w:color w:val="1C1917"/>
+                <w:sz w:val="20"/>
+              </w:rPr>
+              <w:t>Laptop 1</w:t>
+            </w:r>
+          </w:p>
+        </w:tc>
+        <w:tc>
+          <w:tcPr>
+            <w:tcW w:type="dxa" w:w="1624"/>
+            <w:tcBorders>
+              <w:top w:val="single" w:sz="4" w:color="E8E0D5"/>
+              <w:left w:val="single" w:sz="4" w:color="E8E0D5"/>
+              <w:bottom w:val="single" w:sz="4" w:color="E8E0D5"/>
+              <w:right w:val="single" w:sz="4" w:color="E8E0D5"/>
+            </w:tcBorders>
+          </w:tcPr>
+          <w:p>
+            <w:pPr>
+              <w:spacing w:after="40" w:before="40"/>
+            </w:pPr>
+            <w:r/>
+            <w:r>
+              <w:rPr>
+                <w:rFonts w:ascii="Calibri" w:hAnsi="Calibri" w:eastAsia="Calibri"/>
+                <w:b w:val="0"/>
+                <w:i w:val="0"/>
+                <w:color w:val="1C1917"/>
+                <w:sz w:val="20"/>
+              </w:rPr>
+              <w:t>G1</w:t>
+            </w:r>
+          </w:p>
+        </w:tc>
+        <w:tc>
+          <w:tcPr>
+            <w:tcW w:type="dxa" w:w="1624"/>
+            <w:tcBorders>
+              <w:top w:val="single" w:sz="4" w:color="E8E0D5"/>
+              <w:left w:val="single" w:sz="4" w:color="E8E0D5"/>
+              <w:bottom w:val="single" w:sz="4" w:color="E8E0D5"/>
+              <w:right w:val="single" w:sz="4" w:color="E8E0D5"/>
+            </w:tcBorders>
+          </w:tcPr>
+          <w:p>
+            <w:pPr>
+              <w:spacing w:after="40" w:before="40"/>
+            </w:pPr>
+            <w:r/>
+            <w:r>
+              <w:rPr>
+                <w:rFonts w:ascii="Calibri" w:hAnsi="Calibri" w:eastAsia="Calibri"/>
+                <w:b w:val="0"/>
+                <w:i w:val="0"/>
+                <w:color w:val="1C1917"/>
+                <w:sz w:val="20"/>
+              </w:rPr>
+              <w:t>tiga orang</w:t>
+            </w:r>
+          </w:p>
+        </w:tc>
+        <w:tc>
+          <w:tcPr>
+            <w:tcW w:type="dxa" w:w="1624"/>
+            <w:tcBorders>
+              <w:top w:val="single" w:sz="4" w:color="E8E0D5"/>
+              <w:left w:val="single" w:sz="4" w:color="E8E0D5"/>
+              <w:bottom w:val="single" w:sz="4" w:color="E8E0D5"/>
+              <w:right w:val="single" w:sz="4" w:color="E8E0D5"/>
+            </w:tcBorders>
+          </w:tcPr>
+          <w:p>
+            <w:pPr>
+              <w:spacing w:after="40" w:before="40"/>
+            </w:pPr>
+            <w:r/>
+            <w:r>
+              <w:rPr>
+                <w:rFonts w:ascii="Calibri" w:hAnsi="Calibri" w:eastAsia="Calibri"/>
+                <w:b w:val="0"/>
+                <w:i w:val="0"/>
+                <w:color w:val="1C1917"/>
+                <w:sz w:val="20"/>
+              </w:rPr>
+              <w:t>S260901-A + R01 + G1  ·  S260901-A + R02 + G1  ·  S260901-A + R03 + G1</w:t>
+            </w:r>
+          </w:p>
+        </w:tc>
+        <w:tc>
+          <w:tcPr>
+            <w:tcW w:type="dxa" w:w="1624"/>
+            <w:tcBorders>
+              <w:top w:val="single" w:sz="4" w:color="E8E0D5"/>
+              <w:left w:val="single" w:sz="4" w:color="E8E0D5"/>
+              <w:bottom w:val="single" w:sz="4" w:color="E8E0D5"/>
+              <w:right w:val="single" w:sz="4" w:color="E8E0D5"/>
+            </w:tcBorders>
+          </w:tcPr>
+          <w:p>
+            <w:pPr>
+              <w:spacing w:after="40" w:before="40"/>
+            </w:pPr>
+            <w:r/>
+            <w:r>
+              <w:rPr>
+                <w:rFonts w:ascii="Calibri" w:hAnsi="Calibri" w:eastAsia="Calibri"/>
+                <w:b w:val="0"/>
+                <w:i w:val="0"/>
+                <w:color w:val="1C1917"/>
+                <w:sz w:val="20"/>
+              </w:rPr>
+              <w:t>S260901-A + G1</w:t>
+            </w:r>
+          </w:p>
+        </w:tc>
+        <w:tc>
+          <w:tcPr>
+            <w:tcW w:type="dxa" w:w="1624"/>
+            <w:tcBorders>
+              <w:top w:val="single" w:sz="4" w:color="E8E0D5"/>
+              <w:left w:val="single" w:sz="4" w:color="E8E0D5"/>
+              <w:bottom w:val="single" w:sz="4" w:color="E8E0D5"/>
+              <w:right w:val="single" w:sz="4" w:color="E8E0D5"/>
+            </w:tcBorders>
+          </w:tcPr>
+          <w:p>
+            <w:pPr>
+              <w:spacing w:after="40" w:before="40"/>
+            </w:pPr>
+            <w:r/>
+            <w:r>
+              <w:rPr>
+                <w:rFonts w:ascii="Calibri" w:hAnsi="Calibri" w:eastAsia="Calibri"/>
+                <w:b w:val="0"/>
+                <w:i w:val="0"/>
+                <w:color w:val="1C1917"/>
+                <w:sz w:val="20"/>
+              </w:rPr>
+              <w:t>S260901-A-G1.json</w:t>
+            </w:r>
+          </w:p>
+        </w:tc>
+      </w:tr>
+      <w:tr>
+        <w:tc>
+          <w:tcPr>
+            <w:tcW w:type="dxa" w:w="1624"/>
+            <w:tcBorders>
+              <w:top w:val="single" w:sz="4" w:color="E8E0D5"/>
+              <w:left w:val="single" w:sz="4" w:color="E8E0D5"/>
+              <w:bottom w:val="single" w:sz="4" w:color="E8E0D5"/>
+              <w:right w:val="single" w:sz="4" w:color="E8E0D5"/>
+            </w:tcBorders>
+            <w:shd w:fill="F7F3EE" w:val="clear"/>
+          </w:tcPr>
+          <w:p>
+            <w:pPr>
+              <w:spacing w:after="40" w:before="40"/>
+            </w:pPr>
+            <w:r/>
+            <w:r>
+              <w:rPr>
+                <w:rFonts w:ascii="Calibri" w:hAnsi="Calibri" w:eastAsia="Calibri"/>
+                <w:b w:val="0"/>
+                <w:i w:val="0"/>
+                <w:color w:val="1C1917"/>
+                <w:sz w:val="20"/>
+              </w:rPr>
+              <w:t>Laptop 2</w:t>
+            </w:r>
+          </w:p>
+        </w:tc>
+        <w:tc>
+          <w:tcPr>
+            <w:tcW w:type="dxa" w:w="1624"/>
+            <w:tcBorders>
+              <w:top w:val="single" w:sz="4" w:color="E8E0D5"/>
+              <w:left w:val="single" w:sz="4" w:color="E8E0D5"/>
+              <w:bottom w:val="single" w:sz="4" w:color="E8E0D5"/>
+              <w:right w:val="single" w:sz="4" w:color="E8E0D5"/>
+            </w:tcBorders>
+            <w:shd w:fill="F7F3EE" w:val="clear"/>
+          </w:tcPr>
+          <w:p>
+            <w:pPr>
+              <w:spacing w:after="40" w:before="40"/>
+            </w:pPr>
+            <w:r/>
+            <w:r>
+              <w:rPr>
+                <w:rFonts w:ascii="Calibri" w:hAnsi="Calibri" w:eastAsia="Calibri"/>
+                <w:b w:val="0"/>
+                <w:i w:val="0"/>
+                <w:color w:val="1C1917"/>
+                <w:sz w:val="20"/>
+              </w:rPr>
+              <w:t>G2</w:t>
+            </w:r>
+          </w:p>
+        </w:tc>
+        <w:tc>
+          <w:tcPr>
+            <w:tcW w:type="dxa" w:w="1624"/>
+            <w:tcBorders>
+              <w:top w:val="single" w:sz="4" w:color="E8E0D5"/>
+              <w:left w:val="single" w:sz="4" w:color="E8E0D5"/>
+              <w:bottom w:val="single" w:sz="4" w:color="E8E0D5"/>
+              <w:right w:val="single" w:sz="4" w:color="E8E0D5"/>
+            </w:tcBorders>
+            <w:shd w:fill="F7F3EE" w:val="clear"/>
+          </w:tcPr>
+          <w:p>
+            <w:pPr>
+              <w:spacing w:after="40" w:before="40"/>
+            </w:pPr>
+            <w:r/>
+            <w:r>
+              <w:rPr>
+                <w:rFonts w:ascii="Calibri" w:hAnsi="Calibri" w:eastAsia="Calibri"/>
+                <w:b w:val="0"/>
+                <w:i w:val="0"/>
+                <w:color w:val="1C1917"/>
+                <w:sz w:val="20"/>
+              </w:rPr>
+              <w:t>dua orang</w:t>
+            </w:r>
+          </w:p>
+        </w:tc>
+        <w:tc>
+          <w:tcPr>
+            <w:tcW w:type="dxa" w:w="1624"/>
+            <w:tcBorders>
+              <w:top w:val="single" w:sz="4" w:color="E8E0D5"/>
+              <w:left w:val="single" w:sz="4" w:color="E8E0D5"/>
+              <w:bottom w:val="single" w:sz="4" w:color="E8E0D5"/>
+              <w:right w:val="single" w:sz="4" w:color="E8E0D5"/>
+            </w:tcBorders>
+            <w:shd w:fill="F7F3EE" w:val="clear"/>
+          </w:tcPr>
+          <w:p>
+            <w:pPr>
+              <w:spacing w:after="40" w:before="40"/>
+            </w:pPr>
+            <w:r/>
+            <w:r>
+              <w:rPr>
+                <w:rFonts w:ascii="Calibri" w:hAnsi="Calibri" w:eastAsia="Calibri"/>
+                <w:b w:val="0"/>
+                <w:i w:val="0"/>
+                <w:color w:val="1C1917"/>
+                <w:sz w:val="20"/>
+              </w:rPr>
+              <w:t>S260901-A + R04 + G2  ·  S260901-A + R05 + G2</w:t>
+            </w:r>
+          </w:p>
+        </w:tc>
+        <w:tc>
+          <w:tcPr>
+            <w:tcW w:type="dxa" w:w="1624"/>
+            <w:tcBorders>
+              <w:top w:val="single" w:sz="4" w:color="E8E0D5"/>
+              <w:left w:val="single" w:sz="4" w:color="E8E0D5"/>
+              <w:bottom w:val="single" w:sz="4" w:color="E8E0D5"/>
+              <w:right w:val="single" w:sz="4" w:color="E8E0D5"/>
+            </w:tcBorders>
+            <w:shd w:fill="F7F3EE" w:val="clear"/>
+          </w:tcPr>
+          <w:p>
+            <w:pPr>
+              <w:spacing w:after="40" w:before="40"/>
+            </w:pPr>
+            <w:r/>
+            <w:r>
+              <w:rPr>
+                <w:rFonts w:ascii="Calibri" w:hAnsi="Calibri" w:eastAsia="Calibri"/>
+                <w:b w:val="0"/>
+                <w:i w:val="0"/>
+                <w:color w:val="1C1917"/>
+                <w:sz w:val="20"/>
+              </w:rPr>
+              <w:t>S260901-A + G2</w:t>
+            </w:r>
+          </w:p>
+        </w:tc>
+        <w:tc>
+          <w:tcPr>
+            <w:tcW w:type="dxa" w:w="1624"/>
+            <w:tcBorders>
+              <w:top w:val="single" w:sz="4" w:color="E8E0D5"/>
+              <w:left w:val="single" w:sz="4" w:color="E8E0D5"/>
+              <w:bottom w:val="single" w:sz="4" w:color="E8E0D5"/>
+              <w:right w:val="single" w:sz="4" w:color="E8E0D5"/>
+            </w:tcBorders>
+            <w:shd w:fill="F7F3EE" w:val="clear"/>
+          </w:tcPr>
+          <w:p>
+            <w:pPr>
+              <w:spacing w:after="40" w:before="40"/>
+            </w:pPr>
+            <w:r/>
+            <w:r>
+              <w:rPr>
+                <w:rFonts w:ascii="Calibri" w:hAnsi="Calibri" w:eastAsia="Calibri"/>
+                <w:b w:val="0"/>
+                <w:i w:val="0"/>
+                <w:color w:val="1C1917"/>
+                <w:sz w:val="20"/>
+              </w:rPr>
+              <w:t>S260901-A-G2.json</w:t>
+            </w:r>
+          </w:p>
+        </w:tc>
+      </w:tr>
+    </w:tbl>
+    <w:p>
+      <w:pPr>
+        <w:spacing w:after="160"/>
+      </w:pPr>
+    </w:p>
+    <w:p>
+      <w:pPr>
+        <w:spacing w:after="200" w:before="0" w:line="276" w:lineRule="auto"/>
+      </w:pPr>
+      <w:r>
+        <w:rPr>
+          <w:rFonts w:ascii="Calibri" w:hAnsi="Calibri" w:eastAsia="Calibri"/>
+          <w:b w:val="0"/>
+          <w:i w:val="0"/>
+          <w:color w:val="1C1917"/>
+          <w:sz w:val="22"/>
+        </w:rPr>
+        <w:t>Salah: G2 juga R01, R02. Benar: R01 hanya satu orang dalam sesi itu. Nama orang tidak ditulis di papan, di kartu, atau di Form. Nama organisasi di Form apa adanya; ketua menyamarkan di paper. Gabung pra–pasca di Excel urusan ketua peneliti (kolom sesi + R).</w:t>
       </w:r>
     </w:p>
     <w:p>
@@ -2125,7 +3143,7 @@
           <w:color w:val="1C1917"/>
           <w:sz w:val="22"/>
         </w:rPr>
-        <w:t>Tulis kartu: tiap orang satu R (unik dalam sesi), tiap laptop satu G.</w:t>
+        <w:t>Tulis kartu atau papan: SESI dari ketua; tiap laptop satu G; tiap orang satu R unik dalam sesi (lihat contoh Bagian 4).</w:t>
       </w:r>
     </w:p>
     <w:p>
@@ -4425,7 +5443,7 @@
           <w:color w:val="1C1917"/>
           <w:sz w:val="22"/>
         </w:rPr>
-        <w:t>☐  Kode sesi sudah diterima dari ketua peneliti</w:t>
+        <w:t>☐  Kode sesi sudah diterima dari ketua peneliti dan tertulis di papan (contoh S260901-A)</w:t>
       </w:r>
     </w:p>
     <w:p>
@@ -4470,7 +5488,7 @@
           <w:color w:val="1C1917"/>
           <w:sz w:val="22"/>
         </w:rPr>
-        <w:t>☐  Kartu R unik dalam sesi; kartu G per laptop</w:t>
+        <w:t>☐  G per laptop; R unik dalam sesi (G2 tidak mengulang R01); tiap orang tahu tiga kode yang diketik di Form</w:t>
       </w:r>
     </w:p>
     <w:p>
@@ -4620,7 +5638,7 @@
           <w:color w:val="57534E"/>
           <w:sz w:val="18"/>
         </w:rPr>
-        <w:t>SiapKerja! 1.19.1  ·  Pedoman uji coba v1.5  ·  25 Agustus 2026</w:t>
+        <w:t>SiapKerja! 1.19.1  ·  Pedoman uji coba v1.6  ·  25 Agustus 2026</w:t>
         <w:br/>
         <w:t>Ketua peneliti: abduh@itb.ac.id</w:t>
       </w:r>
@@ -4651,7 +5669,7 @@
         <w:color w:val="57534E"/>
         <w:sz w:val="16"/>
       </w:rPr>
-      <w:t>SiapKerja! 1.19.1  ·  Pedoman uji coba v1.5  ·  untuk fasilitator</w:t>
+      <w:t>SiapKerja! 1.19.1  ·  Pedoman uji coba v1.6  ·  untuk fasilitator</w:t>
     </w:r>
   </w:p>
 </w:ftr>

</xml_diff>